<commit_message>
Move Access/Provenance/Licensing (§8) to Appendix B in both HTMLs and rebuilt DOCX
Renumbers §9 Limitations -> §8, §10 Conclusion -> §9. Cross-refs in the body
updated: (§8.2) -> (Appendix B.2), (§8) -> (Appendix B). Matches the same
reorganization already applied to the two-column LaTeX PDF.

Co-Authored-By: Claude Opus 4.7 <noreply@anthropic.com>
</commit_message>
<xml_diff>
--- a/circa_1col.docx
+++ b/circa_1col.docx
@@ -261,6 +261,7 @@
     <w:p>
       <w:pPr>
         <w:pStyle w:val="Keywords"/>
+        <w:spacing w:before="120"/>
         <w:jc w:val="both"/>
         <w:keepNext w:val="0"/>
         <w:keepLines w:val="0"/>
@@ -1221,7 +1222,7 @@
         </w:r>
       </w:hyperlink>
       <w:r>
-        <w:t xml:space="preserve">], so the text stays readable and its date intervals usable without reintroducing patient identity (§8.2).</w:t>
+        <w:t xml:space="preserve">], so the text stays readable and its date intervals usable without reintroducing patient identity (Appendix B.2).</w:t>
       </w:r>
     </w:p>
     <w:tbl>
@@ -3529,7 +3530,7 @@
     <w:p>
       <w:pPr>
         <w:pStyle w:val="TableCaption"/>
-        <w:spacing w:before="280" w:after="60" w:line="240" w:lineRule="auto"/>
+        <w:spacing w:before="40" w:after="40" w:line="240" w:lineRule="auto"/>
         <w:jc w:val="center"/>
         <w:keepNext/>
         <w:keepLines/>
@@ -3631,7 +3632,7 @@
         </w:r>
       </w:hyperlink>
       <w:r>
-        <w:t xml:space="preserve">]. CIRCA differs in what it releases: rather than distributing model-generated notes, it publishes only labels and cross-corpus mappings, layered onto surrogate-filled MIMIC text processed under a Business Associate Agreement with a zero-retention pipeline (§8).</w:t>
+        <w:t xml:space="preserve">]. CIRCA differs in what it releases: rather than distributing model-generated notes, it publishes only labels and cross-corpus mappings, layered onto surrogate-filled MIMIC text processed under a Business Associate Agreement with a zero-retention pipeline (Appendix B).</w:t>
       </w:r>
     </w:p>
     <w:bookmarkEnd w:id="11"/>
@@ -4943,7 +4944,7 @@
     <w:p>
       <w:pPr>
         <w:pStyle w:val="TableCaption"/>
-        <w:spacing w:before="280" w:after="60" w:line="240" w:lineRule="auto"/>
+        <w:spacing w:before="40" w:after="40" w:line="240" w:lineRule="auto"/>
         <w:jc w:val="center"/>
         <w:keepNext/>
         <w:keepLines/>
@@ -6168,7 +6169,7 @@
     <w:p>
       <w:pPr>
         <w:pStyle w:val="TableCaption"/>
-        <w:spacing w:before="280" w:after="60" w:line="240" w:lineRule="auto"/>
+        <w:spacing w:before="40" w:after="40" w:line="240" w:lineRule="auto"/>
         <w:jc w:val="center"/>
         <w:keepNext/>
         <w:keepLines/>
@@ -6880,7 +6881,7 @@
     <w:p>
       <w:pPr>
         <w:pStyle w:val="TableCaption"/>
-        <w:spacing w:before="280" w:after="60" w:line="240" w:lineRule="auto"/>
+        <w:spacing w:before="40" w:after="40" w:line="240" w:lineRule="auto"/>
         <w:jc w:val="center"/>
         <w:keepNext/>
         <w:keepLines/>
@@ -8203,7 +8204,7 @@
     <w:p>
       <w:pPr>
         <w:pStyle w:val="TableCaption"/>
-        <w:spacing w:before="280" w:after="60" w:line="240" w:lineRule="auto"/>
+        <w:spacing w:before="40" w:after="40" w:line="240" w:lineRule="auto"/>
         <w:jc w:val="center"/>
         <w:keepNext/>
         <w:keepLines/>
@@ -10265,7 +10266,7 @@
     <w:p>
       <w:pPr>
         <w:pStyle w:val="TableCaption"/>
-        <w:spacing w:before="280" w:after="60" w:line="240" w:lineRule="auto"/>
+        <w:spacing w:before="40" w:after="40" w:line="240" w:lineRule="auto"/>
         <w:jc w:val="center"/>
         <w:keepNext/>
         <w:keepLines/>
@@ -10328,7 +10329,7 @@
       <w:r>
         <w:drawing>
           <wp:inline>
-            <wp:extent cx="4654709" cy="2086118"/>
+            <wp:extent cx="2880360" cy="1290901"/>
             <wp:effectExtent b="0" l="0" r="0" t="0"/>
             <wp:docPr descr="" title="" id="21" name="Picture"/>
             <a:graphic>
@@ -10349,7 +10350,7 @@
                   <pic:spPr bwMode="auto">
                     <a:xfrm>
                       <a:off x="0" y="0"/>
-                      <a:ext cx="4654709" cy="2086118"/>
+                      <a:ext cx="2880360" cy="1290901"/>
                     </a:xfrm>
                     <a:prstGeom prst="rect">
                       <a:avLst/>
@@ -10371,7 +10372,7 @@
     <w:p>
       <w:pPr>
         <w:pStyle w:val="ImageCaption"/>
-        <w:spacing w:before="80" w:after="120" w:line="240" w:lineRule="auto"/>
+        <w:spacing w:before="40" w:after="40" w:line="240" w:lineRule="auto"/>
         <w:jc w:val="center"/>
         <w:keepNext w:val="0"/>
         <w:keepLines/>
@@ -10478,7 +10479,7 @@
     <w:p>
       <w:pPr>
         <w:pStyle w:val="ImageCaption"/>
-        <w:spacing w:before="80" w:after="120" w:line="240" w:lineRule="auto"/>
+        <w:spacing w:before="40" w:after="40" w:line="240" w:lineRule="auto"/>
         <w:jc w:val="center"/>
         <w:keepNext w:val="0"/>
         <w:keepLines/>
@@ -12734,7 +12735,7 @@
     <w:p>
       <w:pPr>
         <w:pStyle w:val="TableCaption"/>
-        <w:spacing w:before="280" w:after="60" w:line="240" w:lineRule="auto"/>
+        <w:spacing w:before="40" w:after="40" w:line="240" w:lineRule="auto"/>
         <w:jc w:val="center"/>
         <w:keepNext/>
         <w:keepLines/>
@@ -14148,7 +14149,7 @@
     <w:p>
       <w:pPr>
         <w:pStyle w:val="TableCaption"/>
-        <w:spacing w:before="280" w:after="60" w:line="240" w:lineRule="auto"/>
+        <w:spacing w:before="40" w:after="40" w:line="240" w:lineRule="auto"/>
         <w:jc w:val="center"/>
         <w:keepNext/>
         <w:keepLines/>
@@ -15502,7 +15503,7 @@
     <w:p>
       <w:pPr>
         <w:pStyle w:val="TableCaption"/>
-        <w:spacing w:before="280" w:after="60" w:line="240" w:lineRule="auto"/>
+        <w:spacing w:before="40" w:after="40" w:line="240" w:lineRule="auto"/>
         <w:jc w:val="center"/>
         <w:keepNext/>
         <w:keepLines/>
@@ -16865,7 +16866,7 @@
     <w:p>
       <w:pPr>
         <w:pStyle w:val="TableCaption"/>
-        <w:spacing w:before="280" w:after="60" w:line="240" w:lineRule="auto"/>
+        <w:spacing w:before="40" w:after="40" w:line="240" w:lineRule="auto"/>
         <w:jc w:val="center"/>
         <w:keepNext/>
         <w:keepLines/>
@@ -17896,7 +17897,7 @@
     <w:p>
       <w:pPr>
         <w:pStyle w:val="TableCaption"/>
-        <w:spacing w:before="280" w:after="60" w:line="240" w:lineRule="auto"/>
+        <w:spacing w:before="40" w:after="40" w:line="240" w:lineRule="auto"/>
         <w:jc w:val="center"/>
         <w:keepNext/>
         <w:keepLines/>
@@ -19095,7 +19096,7 @@
     <w:p>
       <w:pPr>
         <w:pStyle w:val="TableCaption"/>
-        <w:spacing w:before="280" w:after="60" w:line="240" w:lineRule="auto"/>
+        <w:spacing w:before="40" w:after="40" w:line="240" w:lineRule="auto"/>
         <w:jc w:val="center"/>
         <w:keepNext/>
         <w:keepLines/>
@@ -20133,7 +20134,7 @@
     <w:p>
       <w:pPr>
         <w:pStyle w:val="TableCaption"/>
-        <w:spacing w:before="280" w:after="60" w:line="240" w:lineRule="auto"/>
+        <w:spacing w:before="40" w:after="40" w:line="240" w:lineRule="auto"/>
         <w:jc w:val="center"/>
         <w:keepNext/>
         <w:keepLines/>
@@ -20931,7 +20932,7 @@
     <w:p>
       <w:pPr>
         <w:pStyle w:val="TableCaption"/>
-        <w:spacing w:before="280" w:after="60" w:line="240" w:lineRule="auto"/>
+        <w:spacing w:before="40" w:after="40" w:line="240" w:lineRule="auto"/>
         <w:jc w:val="center"/>
         <w:keepNext/>
         <w:keepLines/>
@@ -20961,7 +20962,7 @@
     </w:p>
     <w:bookmarkEnd w:id="38"/>
     <w:bookmarkEnd w:id="39"/>
-    <w:bookmarkStart w:id="44" w:name="access-provenance-and-licensing"/>
+    <w:bookmarkStart w:id="40" w:name="limitations"/>
     <w:p>
       <w:pPr>
         <w:pStyle w:val="Heading2"/>
@@ -20976,19 +20977,7 @@
         <w:t xml:space="preserve"> </w:t>
       </w:r>
       <w:r>
-        <w:t xml:space="preserve">Access, provenance, and licensing</w:t>
-      </w:r>
-    </w:p>
-    <w:bookmarkStart w:id="40" w:name="intended-uses"/>
-    <w:p>
-      <w:pPr>
-        <w:pStyle w:val="Heading3"/>
-        <w:keepNext/>
-        <w:keepLines/>
-        <w:widowControl w:val="1"/>
-      </w:pPr>
-      <w:r>
-        <w:t xml:space="preserve">8.1 Intended uses</w:t>
+        <w:t xml:space="preserve">Limitations</w:t>
       </w:r>
     </w:p>
     <w:p>
@@ -21000,55 +20989,7 @@
         <w:widowControl w:val="1"/>
       </w:pPr>
       <w:r>
-        <w:t xml:space="preserve">CIRCA supports three things the source corpora cannot do individually: extract prospective actions with their authority and clinical strength under one label space; transfer across annotation schemes and note types; and test whether models preserve clinically consequential distinctions such as conditional-versus-active and prohibited-versus-recommended. The provenance tiers add a fourth: training on the full 10,011-intent resource while evaluating on the human-reviewed core, or studying robustness to silver-label noise. Three concrete uses motivate the release.</w:t>
-      </w:r>
-      <w:r>
-        <w:t xml:space="preserve"> </w:t>
-      </w:r>
-      <w:r>
-        <w:rPr>
-          <w:b/>
-          <w:bCs/>
-        </w:rPr>
-        <w:t xml:space="preserve">(a) Lost-to-follow-up safety:</w:t>
-      </w:r>
-      <w:r>
-        <w:t xml:space="preserve"> </w:t>
-      </w:r>
-      <w:r>
-        <w:t xml:space="preserve">annotations with a validated timing value become trackable deadlines, and the modality axis lets a tracker suppress reminders for prohibited or not-yet-triggered conditional intents; an untracked "repeat CT in 3 months if the nodule persists" is exactly the failure mode behind missed-follow-up harm.</w:t>
-      </w:r>
-      <w:r>
-        <w:t xml:space="preserve"> </w:t>
-      </w:r>
-      <w:r>
-        <w:rPr>
-          <w:b/>
-          <w:bCs/>
-        </w:rPr>
-        <w:t xml:space="preserve">(b) FHIR request-resource serialization:</w:t>
-      </w:r>
-      <w:r>
-        <w:t xml:space="preserve"> </w:t>
-      </w:r>
-      <w:r>
-        <w:t xml:space="preserve">request-intent maps to FHIR RequestIntent and the coded target to the resource, so a CIR record fills in a ServiceRequest, MedicationRequest, or CommunicationRequest entry.</w:t>
-      </w:r>
-      <w:r>
-        <w:t xml:space="preserve"> </w:t>
-      </w:r>
-      <w:r>
-        <w:rPr>
-          <w:b/>
-          <w:bCs/>
-        </w:rPr>
-        <w:t xml:space="preserve">(c) Cross-corpus robustness:</w:t>
-      </w:r>
-      <w:r>
-        <w:t xml:space="preserve"> </w:t>
-      </w:r>
-      <w:r>
-        <w:t xml:space="preserve">the five-corpus, two-distribution design supports training on discharge summaries and testing on dialogue-derived notes, an evaluation only a harmonized resource enables.</w:t>
+        <w:t xml:space="preserve">Construction relies on model agreement, and the human audit (§7.1) calibrates that agreement against correctness. For the five critical fields, which routing checks on every intent, audited accuracy is 88.4%. For the sparse attribute fields, which routing does not check, agreement and correctness can diverge: the time field shows about 90% inter-model agreement against 45% human-validated accuracy (§7.1), because all three models shared an over-generation bias. This divergence is why the release pairs agreement statistics with the audit, and why the audit, not agreement, is the accuracy estimate to cite for sparse fields.</w:t>
       </w:r>
     </w:p>
     <w:p>
@@ -21060,20 +21001,74 @@
         <w:widowControl w:val="1"/>
       </w:pPr>
       <w:r>
-        <w:t xml:space="preserve">CIR output is a structured extraction, not a clinical order, and schema validity is not clinical correctness: an erroneous extraction of a prohibited or conditional action could cause harm if consumed unchecked. The resource is intended for research and system development, not autonomous clinical use.</w:t>
+        <w:t xml:space="preserve">The construction measurements have defined scope. Inter-model agreement is computed on 8 to 40 documents per corpus (Appendix A.1), with correspondingly wide intervals except in the scaled temperature-0 run (Appendix A.3); extending the scaled run to the remaining corpora is a direct next step. The medication arbiter applies to notes carrying structured admission and discharge medication lists, which the assessment-and-plan corpus does not include. Source annotations serve two roles, as evidence shown to annotators and as recall targets, so a no-source-hint ablation is the designated experiment for separating genuine recall from hint propagation.</w:t>
+      </w:r>
+    </w:p>
+    <w:p>
+      <w:pPr>
+        <w:pStyle w:val="BodyText"/>
+        <w:jc w:val="both"/>
+        <w:keepNext w:val="0"/>
+        <w:keepLines w:val="0"/>
+        <w:widowControl w:val="1"/>
+      </w:pPr>
+      <w:r>
+        <w:t xml:space="preserve">The main benchmark evaluates prompted models against the human gold (§7.2). Sonnet, Llama, and Nova contributed candidate labels during construction, so they are construction-involved references; the two gpt-oss models are the independent baselines (§4). A TF-IDF plus logistic-regression cross-corpus baseline (§7.5) establishes a clear transfer gap; a strong trainable-encoder baseline on the released split is future work.</w:t>
+      </w:r>
+    </w:p>
+    <w:p>
+      <w:pPr>
+        <w:pStyle w:val="BodyText"/>
+        <w:jc w:val="both"/>
+        <w:keepNext w:val="0"/>
+        <w:keepLines w:val="0"/>
+        <w:widowControl w:val="1"/>
+      </w:pPr>
+      <w:r>
+        <w:t xml:space="preserve">The gold standard is structured by field. All 2,145 intents are human-checked on the five critical fields; the six sparse fields are human-checked on a 300-intent audit, and target codes are not yet resolved in the gold (§7.4). Records are therefore core-field gold, with sparse-field and code quality quantified by the audits. Per-corpus notes, patients, intents, gold, and routing are reported in Table 6, with split sizes in §6; a full dataset card will add candidate-versus-clustered intent counts. On three corpora the retrospective, over-segmented source gold bounds measurable recovery of some source labels, a property we characterize in Appendix A.2.</w:t>
+      </w:r>
+    </w:p>
+    <w:p>
+      <w:pPr>
+        <w:pStyle w:val="BodyText"/>
+        <w:jc w:val="both"/>
+        <w:keepNext w:val="0"/>
+        <w:keepLines w:val="0"/>
+        <w:widowControl w:val="1"/>
+      </w:pPr>
+      <w:r>
+        <w:t xml:space="preserve">Span coverage has a measured ceiling. Spans come from the source anchors plus LLM extraction, so an intent missed by both the source corpora and the models goes uncounted; the exhaustive from-scratch pass of §7.6 estimates this miss rate at 3.6% on 24 notes (completeness 96.4%), and a larger exhaustive study will tighten the estimate.</w:t>
+      </w:r>
+    </w:p>
+    <w:p>
+      <w:pPr>
+        <w:pStyle w:val="BodyText"/>
+        <w:jc w:val="both"/>
+        <w:keepNext w:val="0"/>
+        <w:keepLines w:val="0"/>
+        <w:widowControl w:val="1"/>
+      </w:pPr>
+      <w:r>
+        <w:t xml:space="preserve">On standards and human validation, the released mapper emits schema-valid FHIR R4 resources for every mappable intent (§3.2); profile-conformance and terminology-binding validation are future work. Reliability is measured by a second annotator relabeling a 211-intent sample (§7.1, moderate-to-substantial kappa); full double annotation of the release and validation by expert clinicians are the next stages of the validation program.</w:t>
       </w:r>
     </w:p>
     <w:bookmarkEnd w:id="40"/>
-    <w:bookmarkStart w:id="41" w:name="data-provenance-and-compliance"/>
+    <w:bookmarkStart w:id="41" w:name="conclusion"/>
     <w:p>
       <w:pPr>
-        <w:pStyle w:val="Heading3"/>
+        <w:pStyle w:val="Heading2"/>
         <w:keepNext/>
         <w:keepLines/>
         <w:widowControl w:val="1"/>
       </w:pPr>
       <w:r>
-        <w:t xml:space="preserve">8.2 Data provenance and compliance</w:t>
+        <w:t xml:space="preserve">9</w:t>
+      </w:r>
+      <w:r>
+        <w:t xml:space="preserve"> </w:t>
+      </w:r>
+      <w:r>
+        <w:t xml:space="preserve">Conclusion</w:t>
       </w:r>
     </w:p>
     <w:p>
@@ -21085,167 +21080,30 @@
         <w:widowControl w:val="1"/>
       </w:pPr>
       <w:r>
-        <w:t xml:space="preserve">Every intent in CIRCA traces to its source note and to the policy under which that note was handled.</w:t>
+        <w:t xml:space="preserve">Prospective clinical intent is annotated in fragments across incompatible corpora. We defined the CIE task and a FHIR-informed representation that adds request-intent and modality as separate axes prior datasets do not jointly represent, and we release CIRCA, a harmonized dataset of 10,011 intents over 1,185 notes and 942 patients across five heterogeneous corpora and two note distributions, with a human-reviewed core of 2,145 validated intents plus 255 reviewed negatives, per-layer licensing, source-to-CIR crosswalks, and a schema-valid FHIR R4 mapper. The dataset is built by a three-model consensus that routes disagreements to human adjudication; the audited agreement stratum matches human judgment 88.4% of the time. Benchmarking five existing models against the human gold shows type is easy (85 to 91%) but the full structured label is not (18 to 35% all-four given the span), with action and modality the hardest fields. All artifacts are released; an exhaustive from-scratch whole-note gold set (§7.6) and a second-annotator reliability study (§7.1) are included; validation by expert clinicians remains future work.</w:t>
       </w:r>
     </w:p>
     <w:p>
-      <w:pPr>
-        <w:pStyle w:val="BodyText"/>
-        <w:jc w:val="both"/>
-        <w:keepNext w:val="0"/>
-        <w:keepLines w:val="0"/>
-        <w:widowControl w:val="1"/>
-      </w:pPr>
-      <w:r>
-        <w:rPr>
-          <w:b/>
-          <w:bCs/>
-        </w:rPr>
-        <w:t xml:space="preserve">Sources.</w:t>
-      </w:r>
-      <w:r>
-        <w:t xml:space="preserve"> </w:t>
-      </w:r>
-      <w:r>
-        <w:t xml:space="preserve">Four corpora (CLIP, MedDec, ap_parsing, PaniniQA) annotate MIMIC-III notes, protected clinical records available only under credentialed PhysioNet access and the MIMIC-III data-use agreement (DUA). The fifth, ACI-Bench, is public, simulated doctor-patient dialogue and contains no real patient data.</w:t>
+      <w:r>
+        <w:pict>
+          <v:rect style="width:0;height:1.5pt" o:hralign="center" o:hrstd="t" o:hr="t"/>
+        </w:pict>
       </w:r>
     </w:p>
+    <w:bookmarkEnd w:id="41"/>
+    <w:bookmarkStart w:id="43" w:name="data-availability"/>
     <w:p>
       <w:pPr>
-        <w:pStyle w:val="BodyText"/>
-        <w:jc w:val="both"/>
-        <w:keepNext w:val="0"/>
-        <w:keepLines w:val="0"/>
-        <w:widowControl w:val="1"/>
-      </w:pPr>
-      <w:r>
-        <w:rPr>
-          <w:b/>
-          <w:bCs/>
-        </w:rPr>
-        <w:t xml:space="preserve">Processing.</w:t>
-      </w:r>
-      <w:r>
-        <w:t xml:space="preserve"> </w:t>
-      </w:r>
-      <w:r>
-        <w:t xml:space="preserve">The notes were never sent to an uncontrolled model endpoint: every annotation-model call ran through Amazon Web Services (AWS) Bedrock under a HIPAA Business Associate Agreement (BAA), on a zero-retention configuration under which no prompt or model output is stored once a request completes. MIMIC-III is de-identified, so a BAA is not strictly required for it; we adopt one as an additional contractual safeguard. This covers the processing infrastructure only and is applied on top of, not in place of, each source corpus's own DUA.</w:t>
-      </w:r>
-    </w:p>
-    <w:p>
-      <w:pPr>
-        <w:pStyle w:val="BodyText"/>
-        <w:jc w:val="both"/>
-        <w:keepNext w:val="0"/>
-        <w:keepLines w:val="0"/>
-        <w:widowControl w:val="1"/>
-      </w:pPr>
-      <w:r>
-        <w:rPr>
-          <w:b/>
-          <w:bCs/>
-        </w:rPr>
-        <w:t xml:space="preserve">De-identification handling (KART).</w:t>
-      </w:r>
-      <w:r>
-        <w:t xml:space="preserve"> </w:t>
-      </w:r>
-      <w:r>
-        <w:t xml:space="preserve">MIMIC notes carry de-identification placeholders (for example</w:t>
-      </w:r>
-      <w:r>
-        <w:t xml:space="preserve"> </w:t>
-      </w:r>
-      <w:r>
-        <w:rPr>
-          <w:rStyle w:val="VerbatimChar"/>
-        </w:rPr>
-        <w:t xml:space="preserve">[**Last Name**]</w:t>
-      </w:r>
-      <w:r>
-        <w:t xml:space="preserve"> </w:t>
-      </w:r>
-      <w:r>
-        <w:t xml:space="preserve">or</w:t>
-      </w:r>
-      <w:r>
-        <w:t xml:space="preserve"> </w:t>
-      </w:r>
-      <w:r>
-        <w:rPr>
-          <w:rStyle w:val="VerbatimChar"/>
-        </w:rPr>
-        <w:t xml:space="preserve">[**2118-6-2**]</w:t>
-      </w:r>
-      <w:r>
-        <w:t xml:space="preserve">) where identifiers were removed. Passing these to a model degrades reading and destroys the time structure that timing extraction depends on, so before model processing we fill each placeholder with a realistic, deterministic surrogate using KART, a surrogate filler extended for discharge summaries and released with the code. KART classifies every placeholder against the PhysioNet de-identification tag grammar and substitutes a synthetic value under two invariants:</w:t>
-      </w:r>
-      <w:r>
-        <w:t xml:space="preserve"> </w:t>
-      </w:r>
-      <w:r>
-        <w:rPr>
-          <w:i/>
-          <w:iCs/>
-        </w:rPr>
-        <w:t xml:space="preserve">consistency</w:t>
-      </w:r>
-      <w:r>
-        <w:t xml:space="preserve"> </w:t>
-      </w:r>
-      <w:r>
-        <w:t xml:space="preserve">(a given placeholder maps to the same surrogate throughout a note) and</w:t>
-      </w:r>
-      <w:r>
-        <w:t xml:space="preserve"> </w:t>
-      </w:r>
-      <w:r>
-        <w:rPr>
-          <w:i/>
-          <w:iCs/>
-        </w:rPr>
-        <w:t xml:space="preserve">interval preservation</w:t>
-      </w:r>
-      <w:r>
-        <w:t xml:space="preserve"> </w:t>
-      </w:r>
-      <w:r>
-        <w:t xml:space="preserve">(all full dates in a note shift by one shared year offset, keeping month and day, so the gaps between dated events are preserved for timing extraction). The released version handles the failure modes a discharge corpus exposes, including date-label echoing, numeric-identifier misrouting, a dedicated initials surrogate, and distinct surrogate names for id-less clinician mentions while protecting the patient's own name; across 100 notes and 4,632 placeholders none was left unclassified. Surrogate values are synthetic and carry no real identifiers; the underlying clinical text remains MIMIC-derived and is processed only under the BAA path above.</w:t>
-      </w:r>
-    </w:p>
-    <w:p>
-      <w:pPr>
-        <w:pStyle w:val="BodyText"/>
-        <w:jc w:val="both"/>
-        <w:keepNext w:val="0"/>
-        <w:keepLines w:val="0"/>
-        <w:widowControl w:val="1"/>
-      </w:pPr>
-      <w:r>
-        <w:rPr>
-          <w:b/>
-          <w:bCs/>
-        </w:rPr>
-        <w:t xml:space="preserve">Release.</w:t>
-      </w:r>
-      <w:r>
-        <w:t xml:space="preserve"> </w:t>
-      </w:r>
-      <w:r>
-        <w:t xml:space="preserve">We publish only derived artifacts, never source note text: the CIR labels and annotations, the source-to-CIR crosswalks, and the per-note KART surrogate mappings. The MIMIC-derived layers ship as stand-off annotations, character offsets and CIR fields keyed to MIMIC note identifiers, together with the surrogate mapping (placeholder offsets and their synthetic fills) and a rebuild script that regenerates the exact text the models read for a user who already holds credentialed MIMIC access (Table 15). Only the ACI-Bench layer, built on public text, is released with its note text.</w:t>
-      </w:r>
-    </w:p>
-    <w:bookmarkEnd w:id="41"/>
-    <w:bookmarkStart w:id="43" w:name="availability-and-licensing"/>
-    <w:p>
-      <w:pPr>
-        <w:pStyle w:val="Heading3"/>
+        <w:pStyle w:val="Heading2"/>
         <w:keepNext/>
         <w:keepLines/>
         <w:widowControl w:val="1"/>
       </w:pPr>
       <w:r>
-        <w:t xml:space="preserve">8.3 Availability and licensing</w:t>
+        <w:t xml:space="preserve"> </w:t>
+      </w:r>
+      <w:r>
+        <w:t xml:space="preserve">Data availability</w:t>
       </w:r>
     </w:p>
     <w:p>
@@ -21257,7 +21115,7 @@
         <w:widowControl w:val="1"/>
       </w:pPr>
       <w:r>
-        <w:t xml:space="preserve">The deposit ships as stand-off CIR records in JSONL, one object per intent with a note identifier, character-offset provenance, and all CIR fields, together with the crosswalks, the KART surrogate mappings, the deterministic FHIR mapper, and the reference evaluator. Each layer inherits the license and data-use agreement of its source corpus (Table 15): the combined resource does not carry a single uniform license. The complete deposit is archived on Zenodo at</w:t>
+        <w:t xml:space="preserve">CIRCA is archived on Zenodo at</w:t>
       </w:r>
       <w:r>
         <w:t xml:space="preserve"> </w:t>
@@ -21271,1227 +21129,7 @@
         </w:r>
       </w:hyperlink>
       <w:r>
-        <w:t xml:space="preserve">.</w:t>
-      </w:r>
-    </w:p>
-    <w:tbl>
-      <w:tblPr>
-        <w:tblStyle w:val="Table"/>
-        <w:tblW w:type="pct" w:w="5000"/>
-        <w:jc w:val="center"/>
-        <w:tblLook w:firstRow="1" w:lastRow="0" w:firstColumn="0" w:lastColumn="0" w:noHBand="0" w:noVBand="0" w:val="0020"/>
-        <w:tblLayout w:type="autofit"/>
-        <w:tblBorders>
-          <w:top w:val="single" w:sz="10" w:color="4F6272"/>
-          <w:bottom w:val="single" w:sz="10" w:color="4F6272"/>
-          <w:insideH w:val="single" w:sz="5" w:color="9FB0C2"/>
-          <w:left w:val="single" w:sz="6" w:color="9FB0C2"/>
-          <w:right w:val="single" w:sz="6" w:color="9FB0C2"/>
-          <w:insideV w:val="single" w:sz="5" w:color="D9E1E8"/>
-        </w:tblBorders>
-      </w:tblPr>
-      <w:tblGrid>
-        <w:gridCol w:w="1584"/>
-        <w:gridCol w:w="1584"/>
-        <w:gridCol w:w="1584"/>
-        <w:gridCol w:w="1584"/>
-        <w:gridCol w:w="1584"/>
-      </w:tblGrid>
-      <w:tr>
-        <w:trPr>
-          <w:tblHeader w:val="on"/>
-        </w:trPr>
-        <w:tc>
-          <w:tcPr>
-            <w:shd w:fill="EEF3F7"/>
-            <w:tcBorders>
-              <w:left w:val="nil"/>
-              <w:right w:val="nil"/>
-              <w:top w:val="nil"/>
-              <w:bottom w:val="single" w:sz="8" w:color="9FB0C2"/>
-            </w:tcBorders>
-            <w:vAlign w:val="center"/>
-          </w:tcPr>
-          <w:p>
-            <w:pPr>
-              <w:pStyle w:val="Compact"/>
-              <w:spacing w:before="0" w:after="20" w:line="240" w:lineRule="auto"/>
-              <w:jc w:val="center"/>
-              <w:suppressAutoHyphens/>
-              <w:keepNext w:val="0"/>
-              <w:keepLines/>
-              <w:widowControl w:val="1"/>
-            </w:pPr>
-            <w:r>
-              <w:rPr>
-                <w:rFonts w:ascii="Times New Roman" w:hAnsi="Times New Roman"/>
-                <w:b/>
-                <w:sz w:val="19"/>
-              </w:rPr>
-              <w:t xml:space="preserve">Layer</w:t>
-            </w:r>
-          </w:p>
-        </w:tc>
-        <w:tc>
-          <w:tcPr>
-            <w:shd w:fill="EEF3F7"/>
-            <w:tcBorders>
-              <w:left w:val="nil"/>
-              <w:right w:val="nil"/>
-              <w:top w:val="nil"/>
-              <w:bottom w:val="single" w:sz="8" w:color="9FB0C2"/>
-            </w:tcBorders>
-            <w:vAlign w:val="center"/>
-          </w:tcPr>
-          <w:p>
-            <w:pPr>
-              <w:pStyle w:val="Compact"/>
-              <w:spacing w:before="0" w:after="20" w:line="240" w:lineRule="auto"/>
-              <w:jc w:val="center"/>
-              <w:suppressAutoHyphens/>
-              <w:keepNext w:val="0"/>
-              <w:keepLines/>
-              <w:widowControl w:val="1"/>
-            </w:pPr>
-            <w:r>
-              <w:rPr>
-                <w:rFonts w:ascii="Times New Roman" w:hAnsi="Times New Roman"/>
-                <w:b/>
-                <w:sz w:val="19"/>
-              </w:rPr>
-              <w:t xml:space="preserve">underlying-text rights</w:t>
-            </w:r>
-          </w:p>
-        </w:tc>
-        <w:tc>
-          <w:tcPr>
-            <w:shd w:fill="EEF3F7"/>
-            <w:tcBorders>
-              <w:left w:val="nil"/>
-              <w:right w:val="nil"/>
-              <w:top w:val="nil"/>
-              <w:bottom w:val="single" w:sz="8" w:color="9FB0C2"/>
-            </w:tcBorders>
-            <w:vAlign w:val="center"/>
-          </w:tcPr>
-          <w:p>
-            <w:pPr>
-              <w:pStyle w:val="Compact"/>
-              <w:spacing w:before="0" w:after="20" w:line="240" w:lineRule="auto"/>
-              <w:jc w:val="center"/>
-              <w:suppressAutoHyphens/>
-              <w:keepNext w:val="0"/>
-              <w:keepLines/>
-              <w:widowControl w:val="1"/>
-            </w:pPr>
-            <w:r>
-              <w:rPr>
-                <w:rFonts w:ascii="Times New Roman" w:hAnsi="Times New Roman"/>
-                <w:b/>
-                <w:sz w:val="19"/>
-              </w:rPr>
-              <w:t xml:space="preserve">annotation license</w:t>
-            </w:r>
-          </w:p>
-        </w:tc>
-        <w:tc>
-          <w:tcPr>
-            <w:shd w:fill="EEF3F7"/>
-            <w:tcBorders>
-              <w:left w:val="nil"/>
-              <w:right w:val="nil"/>
-              <w:top w:val="nil"/>
-              <w:bottom w:val="single" w:sz="8" w:color="9FB0C2"/>
-            </w:tcBorders>
-            <w:vAlign w:val="center"/>
-          </w:tcPr>
-          <w:p>
-            <w:pPr>
-              <w:pStyle w:val="Compact"/>
-              <w:spacing w:before="0" w:after="20" w:line="240" w:lineRule="auto"/>
-              <w:jc w:val="center"/>
-              <w:suppressAutoHyphens/>
-              <w:keepNext w:val="0"/>
-              <w:keepLines/>
-              <w:widowControl w:val="1"/>
-            </w:pPr>
-            <w:r>
-              <w:rPr>
-                <w:rFonts w:ascii="Times New Roman" w:hAnsi="Times New Roman"/>
-                <w:b/>
-                <w:sz w:val="19"/>
-              </w:rPr>
-              <w:t xml:space="preserve">redistributable?</w:t>
-            </w:r>
-          </w:p>
-        </w:tc>
-        <w:tc>
-          <w:tcPr>
-            <w:shd w:fill="EEF3F7"/>
-            <w:tcBorders>
-              <w:left w:val="nil"/>
-              <w:right w:val="nil"/>
-              <w:top w:val="nil"/>
-              <w:bottom w:val="single" w:sz="8" w:color="9FB0C2"/>
-            </w:tcBorders>
-            <w:vAlign w:val="center"/>
-          </w:tcPr>
-          <w:p>
-            <w:pPr>
-              <w:pStyle w:val="Compact"/>
-              <w:spacing w:before="0" w:after="20" w:line="240" w:lineRule="auto"/>
-              <w:jc w:val="center"/>
-              <w:suppressAutoHyphens/>
-              <w:keepNext w:val="0"/>
-              <w:keepLines/>
-              <w:widowControl w:val="1"/>
-            </w:pPr>
-            <w:r>
-              <w:rPr>
-                <w:rFonts w:ascii="Times New Roman" w:hAnsi="Times New Roman"/>
-                <w:b/>
-                <w:sz w:val="19"/>
-              </w:rPr>
-              <w:t xml:space="preserve">access mechanism</w:t>
-            </w:r>
-          </w:p>
-        </w:tc>
-      </w:tr>
-      <w:tr>
-        <w:tc>
-          <w:tcPr>
-            <w:tcBorders>
-              <w:left w:val="nil"/>
-              <w:right w:val="nil"/>
-              <w:top w:val="nil"/>
-              <w:bottom w:val="single" w:sz="4" w:color="D9E1E8"/>
-            </w:tcBorders>
-            <w:vAlign w:val="center"/>
-          </w:tcPr>
-          <w:p>
-            <w:pPr>
-              <w:pStyle w:val="Compact"/>
-              <w:spacing w:before="0" w:after="20" w:line="240" w:lineRule="auto"/>
-              <w:jc w:val="center"/>
-              <w:suppressAutoHyphens/>
-              <w:keepNext w:val="0"/>
-              <w:keepLines/>
-              <w:widowControl w:val="1"/>
-            </w:pPr>
-            <w:r>
-              <w:rPr>
-                <w:rFonts w:ascii="Times New Roman" w:hAnsi="Times New Roman"/>
-                <w:sz w:val="19"/>
-              </w:rPr>
-              <w:t xml:space="preserve">CLIP</w:t>
-            </w:r>
-          </w:p>
-        </w:tc>
-        <w:tc>
-          <w:tcPr>
-            <w:tcBorders>
-              <w:left w:val="nil"/>
-              <w:right w:val="nil"/>
-              <w:top w:val="nil"/>
-              <w:bottom w:val="single" w:sz="4" w:color="D9E1E8"/>
-            </w:tcBorders>
-            <w:vAlign w:val="center"/>
-          </w:tcPr>
-          <w:p>
-            <w:pPr>
-              <w:pStyle w:val="Compact"/>
-              <w:spacing w:before="0" w:after="20" w:line="240" w:lineRule="auto"/>
-              <w:jc w:val="center"/>
-              <w:suppressAutoHyphens/>
-              <w:keepNext w:val="0"/>
-              <w:keepLines/>
-              <w:widowControl w:val="1"/>
-            </w:pPr>
-            <w:r>
-              <w:rPr>
-                <w:rFonts w:ascii="Times New Roman" w:hAnsi="Times New Roman"/>
-                <w:sz w:val="19"/>
-              </w:rPr>
-              <w:t xml:space="preserve">MIMIC-III (PhysioNet DUA)</w:t>
-            </w:r>
-          </w:p>
-        </w:tc>
-        <w:tc>
-          <w:tcPr>
-            <w:tcBorders>
-              <w:left w:val="nil"/>
-              <w:right w:val="nil"/>
-              <w:top w:val="nil"/>
-              <w:bottom w:val="single" w:sz="4" w:color="D9E1E8"/>
-            </w:tcBorders>
-            <w:vAlign w:val="center"/>
-          </w:tcPr>
-          <w:p>
-            <w:pPr>
-              <w:pStyle w:val="Compact"/>
-              <w:spacing w:before="0" w:after="20" w:line="240" w:lineRule="auto"/>
-              <w:jc w:val="center"/>
-              <w:suppressAutoHyphens/>
-              <w:keepNext w:val="0"/>
-              <w:keepLines/>
-              <w:widowControl w:val="1"/>
-            </w:pPr>
-            <w:r>
-              <w:rPr>
-                <w:rFonts w:ascii="Times New Roman" w:hAnsi="Times New Roman"/>
-                <w:sz w:val="19"/>
-              </w:rPr>
-              <w:t xml:space="preserve">source corpus license</w:t>
-            </w:r>
-          </w:p>
-        </w:tc>
-        <w:tc>
-          <w:tcPr>
-            <w:tcBorders>
-              <w:left w:val="nil"/>
-              <w:right w:val="nil"/>
-              <w:top w:val="nil"/>
-              <w:bottom w:val="single" w:sz="4" w:color="D9E1E8"/>
-            </w:tcBorders>
-            <w:vAlign w:val="center"/>
-          </w:tcPr>
-          <w:p>
-            <w:pPr>
-              <w:pStyle w:val="Compact"/>
-              <w:spacing w:before="0" w:after="20" w:line="240" w:lineRule="auto"/>
-              <w:jc w:val="center"/>
-              <w:suppressAutoHyphens/>
-              <w:keepNext w:val="0"/>
-              <w:keepLines/>
-              <w:widowControl w:val="1"/>
-            </w:pPr>
-            <w:r>
-              <w:rPr>
-                <w:rFonts w:ascii="Times New Roman" w:hAnsi="Times New Roman"/>
-                <w:sz w:val="19"/>
-              </w:rPr>
-              <w:t xml:space="preserve">annotations only, no MIMIC text</w:t>
-            </w:r>
-          </w:p>
-        </w:tc>
-        <w:tc>
-          <w:tcPr>
-            <w:tcBorders>
-              <w:left w:val="nil"/>
-              <w:right w:val="nil"/>
-              <w:top w:val="nil"/>
-              <w:bottom w:val="single" w:sz="4" w:color="D9E1E8"/>
-            </w:tcBorders>
-            <w:vAlign w:val="center"/>
-          </w:tcPr>
-          <w:p>
-            <w:pPr>
-              <w:pStyle w:val="Compact"/>
-              <w:spacing w:before="0" w:after="20" w:line="240" w:lineRule="auto"/>
-              <w:jc w:val="center"/>
-              <w:suppressAutoHyphens/>
-              <w:keepNext w:val="0"/>
-              <w:keepLines/>
-              <w:widowControl w:val="1"/>
-            </w:pPr>
-            <w:r>
-              <w:rPr>
-                <w:rFonts w:ascii="Times New Roman" w:hAnsi="Times New Roman"/>
-                <w:sz w:val="19"/>
-              </w:rPr>
-              <w:t xml:space="preserve">PhysioNet credentialed + rebuild script</w:t>
-            </w:r>
-          </w:p>
-        </w:tc>
-      </w:tr>
-      <w:tr>
-        <w:tc>
-          <w:tcPr>
-            <w:tcBorders>
-              <w:left w:val="nil"/>
-              <w:right w:val="nil"/>
-              <w:top w:val="nil"/>
-              <w:bottom w:val="single" w:sz="4" w:color="D9E1E8"/>
-            </w:tcBorders>
-            <w:vAlign w:val="center"/>
-          </w:tcPr>
-          <w:p>
-            <w:pPr>
-              <w:pStyle w:val="Compact"/>
-              <w:spacing w:before="0" w:after="20" w:line="240" w:lineRule="auto"/>
-              <w:jc w:val="center"/>
-              <w:suppressAutoHyphens/>
-              <w:keepNext w:val="0"/>
-              <w:keepLines/>
-              <w:widowControl w:val="1"/>
-            </w:pPr>
-            <w:r>
-              <w:rPr>
-                <w:rFonts w:ascii="Times New Roman" w:hAnsi="Times New Roman"/>
-                <w:sz w:val="19"/>
-              </w:rPr>
-              <w:t xml:space="preserve">MedDec</w:t>
-            </w:r>
-          </w:p>
-        </w:tc>
-        <w:tc>
-          <w:tcPr>
-            <w:tcBorders>
-              <w:left w:val="nil"/>
-              <w:right w:val="nil"/>
-              <w:top w:val="nil"/>
-              <w:bottom w:val="single" w:sz="4" w:color="D9E1E8"/>
-            </w:tcBorders>
-            <w:vAlign w:val="center"/>
-          </w:tcPr>
-          <w:p>
-            <w:pPr>
-              <w:pStyle w:val="Compact"/>
-              <w:spacing w:before="0" w:after="20" w:line="240" w:lineRule="auto"/>
-              <w:jc w:val="center"/>
-              <w:suppressAutoHyphens/>
-              <w:keepNext w:val="0"/>
-              <w:keepLines/>
-              <w:widowControl w:val="1"/>
-            </w:pPr>
-            <w:r>
-              <w:rPr>
-                <w:rFonts w:ascii="Times New Roman" w:hAnsi="Times New Roman"/>
-                <w:sz w:val="19"/>
-              </w:rPr>
-              <w:t xml:space="preserve">MIMIC-III (PhysioNet DUA)</w:t>
-            </w:r>
-          </w:p>
-        </w:tc>
-        <w:tc>
-          <w:tcPr>
-            <w:tcBorders>
-              <w:left w:val="nil"/>
-              <w:right w:val="nil"/>
-              <w:top w:val="nil"/>
-              <w:bottom w:val="single" w:sz="4" w:color="D9E1E8"/>
-            </w:tcBorders>
-            <w:vAlign w:val="center"/>
-          </w:tcPr>
-          <w:p>
-            <w:pPr>
-              <w:pStyle w:val="Compact"/>
-              <w:spacing w:before="0" w:after="20" w:line="240" w:lineRule="auto"/>
-              <w:jc w:val="center"/>
-              <w:suppressAutoHyphens/>
-              <w:keepNext w:val="0"/>
-              <w:keepLines/>
-              <w:widowControl w:val="1"/>
-            </w:pPr>
-            <w:r>
-              <w:rPr>
-                <w:rFonts w:ascii="Times New Roman" w:hAnsi="Times New Roman"/>
-                <w:sz w:val="19"/>
-              </w:rPr>
-              <w:t xml:space="preserve">source corpus license</w:t>
-            </w:r>
-          </w:p>
-        </w:tc>
-        <w:tc>
-          <w:tcPr>
-            <w:tcBorders>
-              <w:left w:val="nil"/>
-              <w:right w:val="nil"/>
-              <w:top w:val="nil"/>
-              <w:bottom w:val="single" w:sz="4" w:color="D9E1E8"/>
-            </w:tcBorders>
-            <w:vAlign w:val="center"/>
-          </w:tcPr>
-          <w:p>
-            <w:pPr>
-              <w:pStyle w:val="Compact"/>
-              <w:spacing w:before="0" w:after="20" w:line="240" w:lineRule="auto"/>
-              <w:jc w:val="center"/>
-              <w:suppressAutoHyphens/>
-              <w:keepNext w:val="0"/>
-              <w:keepLines/>
-              <w:widowControl w:val="1"/>
-            </w:pPr>
-            <w:r>
-              <w:rPr>
-                <w:rFonts w:ascii="Times New Roman" w:hAnsi="Times New Roman"/>
-                <w:sz w:val="19"/>
-              </w:rPr>
-              <w:t xml:space="preserve">annotations only, no MIMIC text</w:t>
-            </w:r>
-          </w:p>
-        </w:tc>
-        <w:tc>
-          <w:tcPr>
-            <w:tcBorders>
-              <w:left w:val="nil"/>
-              <w:right w:val="nil"/>
-              <w:top w:val="nil"/>
-              <w:bottom w:val="single" w:sz="4" w:color="D9E1E8"/>
-            </w:tcBorders>
-            <w:vAlign w:val="center"/>
-          </w:tcPr>
-          <w:p>
-            <w:pPr>
-              <w:pStyle w:val="Compact"/>
-              <w:spacing w:before="0" w:after="20" w:line="240" w:lineRule="auto"/>
-              <w:jc w:val="center"/>
-              <w:suppressAutoHyphens/>
-              <w:keepNext w:val="0"/>
-              <w:keepLines/>
-              <w:widowControl w:val="1"/>
-            </w:pPr>
-            <w:r>
-              <w:rPr>
-                <w:rFonts w:ascii="Times New Roman" w:hAnsi="Times New Roman"/>
-                <w:sz w:val="19"/>
-              </w:rPr>
-              <w:t xml:space="preserve">PhysioNet credentialed + rebuild script</w:t>
-            </w:r>
-          </w:p>
-        </w:tc>
-      </w:tr>
-      <w:tr>
-        <w:tc>
-          <w:tcPr>
-            <w:tcBorders>
-              <w:left w:val="nil"/>
-              <w:right w:val="nil"/>
-              <w:top w:val="nil"/>
-              <w:bottom w:val="single" w:sz="4" w:color="D9E1E8"/>
-            </w:tcBorders>
-            <w:vAlign w:val="center"/>
-          </w:tcPr>
-          <w:p>
-            <w:pPr>
-              <w:pStyle w:val="Compact"/>
-              <w:spacing w:before="0" w:after="20" w:line="240" w:lineRule="auto"/>
-              <w:jc w:val="center"/>
-              <w:suppressAutoHyphens/>
-              <w:keepNext w:val="0"/>
-              <w:keepLines/>
-              <w:widowControl w:val="1"/>
-            </w:pPr>
-            <w:r>
-              <w:rPr>
-                <w:rFonts w:ascii="Times New Roman" w:hAnsi="Times New Roman"/>
-                <w:sz w:val="19"/>
-              </w:rPr>
-              <w:t xml:space="preserve">ap_parsing</w:t>
-            </w:r>
-          </w:p>
-        </w:tc>
-        <w:tc>
-          <w:tcPr>
-            <w:tcBorders>
-              <w:left w:val="nil"/>
-              <w:right w:val="nil"/>
-              <w:top w:val="nil"/>
-              <w:bottom w:val="single" w:sz="4" w:color="D9E1E8"/>
-            </w:tcBorders>
-            <w:vAlign w:val="center"/>
-          </w:tcPr>
-          <w:p>
-            <w:pPr>
-              <w:pStyle w:val="Compact"/>
-              <w:spacing w:before="0" w:after="20" w:line="240" w:lineRule="auto"/>
-              <w:jc w:val="center"/>
-              <w:suppressAutoHyphens/>
-              <w:keepNext w:val="0"/>
-              <w:keepLines/>
-              <w:widowControl w:val="1"/>
-            </w:pPr>
-            <w:r>
-              <w:rPr>
-                <w:rFonts w:ascii="Times New Roman" w:hAnsi="Times New Roman"/>
-                <w:sz w:val="19"/>
-              </w:rPr>
-              <w:t xml:space="preserve">MIMIC-III (PhysioNet DUA)</w:t>
-            </w:r>
-          </w:p>
-        </w:tc>
-        <w:tc>
-          <w:tcPr>
-            <w:tcBorders>
-              <w:left w:val="nil"/>
-              <w:right w:val="nil"/>
-              <w:top w:val="nil"/>
-              <w:bottom w:val="single" w:sz="4" w:color="D9E1E8"/>
-            </w:tcBorders>
-            <w:vAlign w:val="center"/>
-          </w:tcPr>
-          <w:p>
-            <w:pPr>
-              <w:pStyle w:val="Compact"/>
-              <w:spacing w:before="0" w:after="20" w:line="240" w:lineRule="auto"/>
-              <w:jc w:val="center"/>
-              <w:suppressAutoHyphens/>
-              <w:keepNext w:val="0"/>
-              <w:keepLines/>
-              <w:widowControl w:val="1"/>
-            </w:pPr>
-            <w:r>
-              <w:rPr>
-                <w:rFonts w:ascii="Times New Roman" w:hAnsi="Times New Roman"/>
-                <w:sz w:val="19"/>
-              </w:rPr>
-              <w:t xml:space="preserve">source corpus license</w:t>
-            </w:r>
-          </w:p>
-        </w:tc>
-        <w:tc>
-          <w:tcPr>
-            <w:tcBorders>
-              <w:left w:val="nil"/>
-              <w:right w:val="nil"/>
-              <w:top w:val="nil"/>
-              <w:bottom w:val="single" w:sz="4" w:color="D9E1E8"/>
-            </w:tcBorders>
-            <w:vAlign w:val="center"/>
-          </w:tcPr>
-          <w:p>
-            <w:pPr>
-              <w:pStyle w:val="Compact"/>
-              <w:spacing w:before="0" w:after="20" w:line="240" w:lineRule="auto"/>
-              <w:jc w:val="center"/>
-              <w:suppressAutoHyphens/>
-              <w:keepNext w:val="0"/>
-              <w:keepLines/>
-              <w:widowControl w:val="1"/>
-            </w:pPr>
-            <w:r>
-              <w:rPr>
-                <w:rFonts w:ascii="Times New Roman" w:hAnsi="Times New Roman"/>
-                <w:sz w:val="19"/>
-              </w:rPr>
-              <w:t xml:space="preserve">annotations only, no MIMIC text</w:t>
-            </w:r>
-          </w:p>
-        </w:tc>
-        <w:tc>
-          <w:tcPr>
-            <w:tcBorders>
-              <w:left w:val="nil"/>
-              <w:right w:val="nil"/>
-              <w:top w:val="nil"/>
-              <w:bottom w:val="single" w:sz="4" w:color="D9E1E8"/>
-            </w:tcBorders>
-            <w:vAlign w:val="center"/>
-          </w:tcPr>
-          <w:p>
-            <w:pPr>
-              <w:pStyle w:val="Compact"/>
-              <w:spacing w:before="0" w:after="20" w:line="240" w:lineRule="auto"/>
-              <w:jc w:val="center"/>
-              <w:suppressAutoHyphens/>
-              <w:keepNext w:val="0"/>
-              <w:keepLines/>
-              <w:widowControl w:val="1"/>
-            </w:pPr>
-            <w:r>
-              <w:rPr>
-                <w:rFonts w:ascii="Times New Roman" w:hAnsi="Times New Roman"/>
-                <w:sz w:val="19"/>
-              </w:rPr>
-              <w:t xml:space="preserve">PhysioNet credentialed + rebuild script</w:t>
-            </w:r>
-          </w:p>
-        </w:tc>
-      </w:tr>
-      <w:tr>
-        <w:tc>
-          <w:tcPr>
-            <w:tcBorders>
-              <w:left w:val="nil"/>
-              <w:right w:val="nil"/>
-              <w:top w:val="nil"/>
-              <w:bottom w:val="single" w:sz="4" w:color="D9E1E8"/>
-            </w:tcBorders>
-            <w:vAlign w:val="center"/>
-          </w:tcPr>
-          <w:p>
-            <w:pPr>
-              <w:pStyle w:val="Compact"/>
-              <w:spacing w:before="0" w:after="20" w:line="240" w:lineRule="auto"/>
-              <w:jc w:val="center"/>
-              <w:suppressAutoHyphens/>
-              <w:keepNext w:val="0"/>
-              <w:keepLines/>
-              <w:widowControl w:val="1"/>
-            </w:pPr>
-            <w:r>
-              <w:rPr>
-                <w:rFonts w:ascii="Times New Roman" w:hAnsi="Times New Roman"/>
-                <w:sz w:val="19"/>
-              </w:rPr>
-              <w:t xml:space="preserve">PaniniQA</w:t>
-            </w:r>
-          </w:p>
-        </w:tc>
-        <w:tc>
-          <w:tcPr>
-            <w:tcBorders>
-              <w:left w:val="nil"/>
-              <w:right w:val="nil"/>
-              <w:top w:val="nil"/>
-              <w:bottom w:val="single" w:sz="4" w:color="D9E1E8"/>
-            </w:tcBorders>
-            <w:vAlign w:val="center"/>
-          </w:tcPr>
-          <w:p>
-            <w:pPr>
-              <w:pStyle w:val="Compact"/>
-              <w:spacing w:before="0" w:after="20" w:line="240" w:lineRule="auto"/>
-              <w:jc w:val="center"/>
-              <w:suppressAutoHyphens/>
-              <w:keepNext w:val="0"/>
-              <w:keepLines/>
-              <w:widowControl w:val="1"/>
-            </w:pPr>
-            <w:r>
-              <w:rPr>
-                <w:rFonts w:ascii="Times New Roman" w:hAnsi="Times New Roman"/>
-                <w:sz w:val="19"/>
-              </w:rPr>
-              <w:t xml:space="preserve">MIMIC-III (PhysioNet DUA)</w:t>
-            </w:r>
-          </w:p>
-        </w:tc>
-        <w:tc>
-          <w:tcPr>
-            <w:tcBorders>
-              <w:left w:val="nil"/>
-              <w:right w:val="nil"/>
-              <w:top w:val="nil"/>
-              <w:bottom w:val="single" w:sz="4" w:color="D9E1E8"/>
-            </w:tcBorders>
-            <w:vAlign w:val="center"/>
-          </w:tcPr>
-          <w:p>
-            <w:pPr>
-              <w:pStyle w:val="Compact"/>
-              <w:spacing w:before="0" w:after="20" w:line="240" w:lineRule="auto"/>
-              <w:jc w:val="center"/>
-              <w:suppressAutoHyphens/>
-              <w:keepNext w:val="0"/>
-              <w:keepLines/>
-              <w:widowControl w:val="1"/>
-            </w:pPr>
-            <w:r>
-              <w:rPr>
-                <w:rFonts w:ascii="Times New Roman" w:hAnsi="Times New Roman"/>
-                <w:sz w:val="19"/>
-              </w:rPr>
-              <w:t xml:space="preserve">source corpus license</w:t>
-            </w:r>
-          </w:p>
-        </w:tc>
-        <w:tc>
-          <w:tcPr>
-            <w:tcBorders>
-              <w:left w:val="nil"/>
-              <w:right w:val="nil"/>
-              <w:top w:val="nil"/>
-              <w:bottom w:val="single" w:sz="4" w:color="D9E1E8"/>
-            </w:tcBorders>
-            <w:vAlign w:val="center"/>
-          </w:tcPr>
-          <w:p>
-            <w:pPr>
-              <w:pStyle w:val="Compact"/>
-              <w:spacing w:before="0" w:after="20" w:line="240" w:lineRule="auto"/>
-              <w:jc w:val="center"/>
-              <w:suppressAutoHyphens/>
-              <w:keepNext w:val="0"/>
-              <w:keepLines/>
-              <w:widowControl w:val="1"/>
-            </w:pPr>
-            <w:r>
-              <w:rPr>
-                <w:rFonts w:ascii="Times New Roman" w:hAnsi="Times New Roman"/>
-                <w:sz w:val="19"/>
-              </w:rPr>
-              <w:t xml:space="preserve">annotations only, no MIMIC text</w:t>
-            </w:r>
-          </w:p>
-        </w:tc>
-        <w:tc>
-          <w:tcPr>
-            <w:tcBorders>
-              <w:left w:val="nil"/>
-              <w:right w:val="nil"/>
-              <w:top w:val="nil"/>
-              <w:bottom w:val="single" w:sz="4" w:color="D9E1E8"/>
-            </w:tcBorders>
-            <w:vAlign w:val="center"/>
-          </w:tcPr>
-          <w:p>
-            <w:pPr>
-              <w:pStyle w:val="Compact"/>
-              <w:spacing w:before="0" w:after="20" w:line="240" w:lineRule="auto"/>
-              <w:jc w:val="center"/>
-              <w:suppressAutoHyphens/>
-              <w:keepNext w:val="0"/>
-              <w:keepLines/>
-              <w:widowControl w:val="1"/>
-            </w:pPr>
-            <w:r>
-              <w:rPr>
-                <w:rFonts w:ascii="Times New Roman" w:hAnsi="Times New Roman"/>
-                <w:sz w:val="19"/>
-              </w:rPr>
-              <w:t xml:space="preserve">PhysioNet credentialed + rebuild script</w:t>
-            </w:r>
-          </w:p>
-        </w:tc>
-      </w:tr>
-      <w:tr>
-        <w:tc>
-          <w:tcPr>
-            <w:tcBorders>
-              <w:left w:val="nil"/>
-              <w:right w:val="nil"/>
-              <w:top w:val="nil"/>
-              <w:bottom w:val="single" w:sz="4" w:color="D9E1E8"/>
-            </w:tcBorders>
-            <w:vAlign w:val="center"/>
-          </w:tcPr>
-          <w:p>
-            <w:pPr>
-              <w:pStyle w:val="Compact"/>
-              <w:spacing w:before="0" w:after="20" w:line="240" w:lineRule="auto"/>
-              <w:jc w:val="center"/>
-              <w:suppressAutoHyphens/>
-              <w:keepNext w:val="0"/>
-              <w:keepLines/>
-              <w:widowControl w:val="1"/>
-            </w:pPr>
-            <w:r>
-              <w:rPr>
-                <w:rFonts w:ascii="Times New Roman" w:hAnsi="Times New Roman"/>
-                <w:sz w:val="19"/>
-              </w:rPr>
-              <w:t xml:space="preserve">SIMORD / ACI-Bench</w:t>
-            </w:r>
-          </w:p>
-        </w:tc>
-        <w:tc>
-          <w:tcPr>
-            <w:tcBorders>
-              <w:left w:val="nil"/>
-              <w:right w:val="nil"/>
-              <w:top w:val="nil"/>
-              <w:bottom w:val="single" w:sz="4" w:color="D9E1E8"/>
-            </w:tcBorders>
-            <w:vAlign w:val="center"/>
-          </w:tcPr>
-          <w:p>
-            <w:pPr>
-              <w:pStyle w:val="Compact"/>
-              <w:spacing w:before="0" w:after="20" w:line="240" w:lineRule="auto"/>
-              <w:jc w:val="center"/>
-              <w:suppressAutoHyphens/>
-              <w:keepNext w:val="0"/>
-              <w:keepLines/>
-              <w:widowControl w:val="1"/>
-            </w:pPr>
-            <w:r>
-              <w:rPr>
-                <w:rFonts w:ascii="Times New Roman" w:hAnsi="Times New Roman"/>
-                <w:sz w:val="19"/>
-              </w:rPr>
-              <w:t xml:space="preserve">ACI-Bench (public, simulated, CC BY 4.0)</w:t>
-            </w:r>
-          </w:p>
-        </w:tc>
-        <w:tc>
-          <w:tcPr>
-            <w:tcBorders>
-              <w:left w:val="nil"/>
-              <w:right w:val="nil"/>
-              <w:top w:val="nil"/>
-              <w:bottom w:val="single" w:sz="4" w:color="D9E1E8"/>
-            </w:tcBorders>
-            <w:vAlign w:val="center"/>
-          </w:tcPr>
-          <w:p>
-            <w:pPr>
-              <w:pStyle w:val="Compact"/>
-              <w:spacing w:before="0" w:after="20" w:line="240" w:lineRule="auto"/>
-              <w:jc w:val="center"/>
-              <w:suppressAutoHyphens/>
-              <w:keepNext w:val="0"/>
-              <w:keepLines/>
-              <w:widowControl w:val="1"/>
-            </w:pPr>
-            <w:r>
-              <w:rPr>
-                <w:rFonts w:ascii="Times New Roman" w:hAnsi="Times New Roman"/>
-                <w:sz w:val="19"/>
-              </w:rPr>
-              <w:t xml:space="preserve">CDLA-Permissive-2.0</w:t>
-            </w:r>
-          </w:p>
-        </w:tc>
-        <w:tc>
-          <w:tcPr>
-            <w:tcBorders>
-              <w:left w:val="nil"/>
-              <w:right w:val="nil"/>
-              <w:top w:val="nil"/>
-              <w:bottom w:val="single" w:sz="4" w:color="D9E1E8"/>
-            </w:tcBorders>
-            <w:vAlign w:val="center"/>
-          </w:tcPr>
-          <w:p>
-            <w:pPr>
-              <w:pStyle w:val="Compact"/>
-              <w:spacing w:before="0" w:after="20" w:line="240" w:lineRule="auto"/>
-              <w:jc w:val="center"/>
-              <w:suppressAutoHyphens/>
-              <w:keepNext w:val="0"/>
-              <w:keepLines/>
-              <w:widowControl w:val="1"/>
-            </w:pPr>
-            <w:r>
-              <w:rPr>
-                <w:rFonts w:ascii="Times New Roman" w:hAnsi="Times New Roman"/>
-                <w:sz w:val="19"/>
-              </w:rPr>
-              <w:t xml:space="preserve">text and annotations</w:t>
-            </w:r>
-          </w:p>
-        </w:tc>
-        <w:tc>
-          <w:tcPr>
-            <w:tcBorders>
-              <w:left w:val="nil"/>
-              <w:right w:val="nil"/>
-              <w:top w:val="nil"/>
-              <w:bottom w:val="single" w:sz="4" w:color="D9E1E8"/>
-            </w:tcBorders>
-            <w:vAlign w:val="center"/>
-          </w:tcPr>
-          <w:p>
-            <w:pPr>
-              <w:pStyle w:val="Compact"/>
-              <w:spacing w:before="0" w:after="20" w:line="240" w:lineRule="auto"/>
-              <w:jc w:val="center"/>
-              <w:suppressAutoHyphens/>
-              <w:keepNext w:val="0"/>
-              <w:keepLines/>
-              <w:widowControl w:val="1"/>
-            </w:pPr>
-            <w:r>
-              <w:rPr>
-                <w:rFonts w:ascii="Times New Roman" w:hAnsi="Times New Roman"/>
-                <w:sz w:val="19"/>
-              </w:rPr>
-              <w:t xml:space="preserve">direct download</w:t>
-            </w:r>
-          </w:p>
-        </w:tc>
-      </w:tr>
-      <w:tr>
-        <w:tc>
-          <w:tcPr>
-            <w:tcBorders>
-              <w:left w:val="nil"/>
-              <w:right w:val="nil"/>
-              <w:top w:val="nil"/>
-              <w:bottom w:val="nil"/>
-            </w:tcBorders>
-            <w:vAlign w:val="center"/>
-          </w:tcPr>
-          <w:p>
-            <w:pPr>
-              <w:pStyle w:val="Compact"/>
-              <w:spacing w:before="0" w:after="20" w:line="240" w:lineRule="auto"/>
-              <w:jc w:val="center"/>
-              <w:suppressAutoHyphens/>
-              <w:keepNext w:val="0"/>
-              <w:keepLines/>
-              <w:widowControl w:val="1"/>
-            </w:pPr>
-            <w:r>
-              <w:rPr>
-                <w:rFonts w:ascii="Times New Roman" w:hAnsi="Times New Roman"/>
-                <w:sz w:val="19"/>
-              </w:rPr>
-              <w:t xml:space="preserve">CIR annotation layer (ours)</w:t>
-            </w:r>
-          </w:p>
-        </w:tc>
-        <w:tc>
-          <w:tcPr>
-            <w:tcBorders>
-              <w:left w:val="nil"/>
-              <w:right w:val="nil"/>
-              <w:top w:val="nil"/>
-              <w:bottom w:val="nil"/>
-            </w:tcBorders>
-            <w:vAlign w:val="center"/>
-          </w:tcPr>
-          <w:p>
-            <w:pPr>
-              <w:pStyle w:val="Compact"/>
-              <w:spacing w:before="0" w:after="20" w:line="240" w:lineRule="auto"/>
-              <w:jc w:val="center"/>
-              <w:suppressAutoHyphens/>
-              <w:keepNext w:val="0"/>
-              <w:keepLines/>
-              <w:widowControl w:val="1"/>
-            </w:pPr>
-            <w:r>
-              <w:rPr>
-                <w:rFonts w:ascii="Times New Roman" w:hAnsi="Times New Roman"/>
-                <w:sz w:val="19"/>
-              </w:rPr>
-              <w:t xml:space="preserve">per source layer above</w:t>
-            </w:r>
-          </w:p>
-        </w:tc>
-        <w:tc>
-          <w:tcPr>
-            <w:tcBorders>
-              <w:left w:val="nil"/>
-              <w:right w:val="nil"/>
-              <w:top w:val="nil"/>
-              <w:bottom w:val="nil"/>
-            </w:tcBorders>
-            <w:vAlign w:val="center"/>
-          </w:tcPr>
-          <w:p>
-            <w:pPr>
-              <w:pStyle w:val="Compact"/>
-              <w:spacing w:before="0" w:after="20" w:line="240" w:lineRule="auto"/>
-              <w:jc w:val="center"/>
-              <w:suppressAutoHyphens/>
-              <w:keepNext w:val="0"/>
-              <w:keepLines/>
-              <w:widowControl w:val="1"/>
-            </w:pPr>
-            <w:r>
-              <w:rPr>
-                <w:rFonts w:ascii="Times New Roman" w:hAnsi="Times New Roman"/>
-                <w:sz w:val="19"/>
-              </w:rPr>
-              <w:t xml:space="preserve">CC BY 4.0</w:t>
-            </w:r>
-          </w:p>
-        </w:tc>
-        <w:tc>
-          <w:tcPr>
-            <w:tcBorders>
-              <w:left w:val="nil"/>
-              <w:right w:val="nil"/>
-              <w:top w:val="nil"/>
-              <w:bottom w:val="nil"/>
-            </w:tcBorders>
-            <w:vAlign w:val="center"/>
-          </w:tcPr>
-          <w:p>
-            <w:pPr>
-              <w:pStyle w:val="Compact"/>
-              <w:spacing w:before="0" w:after="20" w:line="240" w:lineRule="auto"/>
-              <w:jc w:val="center"/>
-              <w:suppressAutoHyphens/>
-              <w:keepNext w:val="0"/>
-              <w:keepLines/>
-              <w:widowControl w:val="1"/>
-            </w:pPr>
-            <w:r>
-              <w:rPr>
-                <w:rFonts w:ascii="Times New Roman" w:hAnsi="Times New Roman"/>
-                <w:sz w:val="19"/>
-              </w:rPr>
-              <w:t xml:space="preserve">annotations + crosswalks + code</w:t>
-            </w:r>
-          </w:p>
-        </w:tc>
-        <w:tc>
-          <w:tcPr>
-            <w:tcBorders>
-              <w:left w:val="nil"/>
-              <w:right w:val="nil"/>
-              <w:top w:val="nil"/>
-              <w:bottom w:val="nil"/>
-            </w:tcBorders>
-            <w:vAlign w:val="center"/>
-          </w:tcPr>
-          <w:p>
-            <w:pPr>
-              <w:pStyle w:val="Compact"/>
-              <w:spacing w:before="0" w:after="20" w:line="240" w:lineRule="auto"/>
-              <w:jc w:val="center"/>
-              <w:suppressAutoHyphens/>
-              <w:keepNext w:val="0"/>
-              <w:keepLines/>
-              <w:widowControl w:val="1"/>
-            </w:pPr>
-            <w:r>
-              <w:rPr>
-                <w:rFonts w:ascii="Times New Roman" w:hAnsi="Times New Roman"/>
-                <w:sz w:val="19"/>
-              </w:rPr>
-              <w:t xml:space="preserve">repository</w:t>
-            </w:r>
-          </w:p>
-        </w:tc>
-      </w:tr>
-    </w:tbl>
-    <w:p>
-      <w:pPr>
-        <w:pStyle w:val="TableCaption"/>
-        <w:spacing w:before="280" w:after="60" w:line="240" w:lineRule="auto"/>
-        <w:jc w:val="center"/>
-        <w:keepNext/>
-        <w:keepLines/>
-        <w:widowControl w:val="1"/>
-      </w:pPr>
-      <w:r>
-        <w:rPr>
-          <w:b/>
-          <w:i/>
-        </w:rPr>
-        <w:t>Table 15.</w:t>
-      </w:r>
-      <w:r>
-        <w:rPr>
-          <w:b w:val="0"/>
-          <w:i/>
-        </w:rPr>
-        <w:t xml:space="preserve"> </w:t>
-      </w:r>
-      <w:r>
-        <w:rPr>
-          <w:b w:val="0"/>
-          <w:i/>
-        </w:rPr>
-        <w:t>Per-layer rights and access. The combined resource does not carry a single uniform license: each layer inherits the rights of its underlying text, and only the SIMORD/ACI-Bench layer can be redistributed with its text. The mapper, evaluator, and crosswalks are released under an open code license.</w:t>
-      </w:r>
-    </w:p>
-    <w:bookmarkEnd w:id="43"/>
-    <w:bookmarkEnd w:id="44"/>
-    <w:bookmarkStart w:id="45" w:name="limitations"/>
-    <w:p>
-      <w:pPr>
-        <w:pStyle w:val="Heading2"/>
-        <w:keepNext/>
-        <w:keepLines/>
-        <w:widowControl w:val="1"/>
-      </w:pPr>
-      <w:r>
-        <w:t xml:space="preserve">9</w:t>
-      </w:r>
-      <w:r>
-        <w:t xml:space="preserve"> </w:t>
-      </w:r>
-      <w:r>
-        <w:t xml:space="preserve">Limitations</w:t>
-      </w:r>
-    </w:p>
-    <w:p>
-      <w:pPr>
-        <w:pStyle w:val="FirstParagraph"/>
-        <w:jc w:val="both"/>
-        <w:keepNext w:val="0"/>
-        <w:keepLines w:val="0"/>
-        <w:widowControl w:val="1"/>
-      </w:pPr>
-      <w:r>
-        <w:t xml:space="preserve">Construction relies on model agreement, and the human audit (§7.1) calibrates that agreement against correctness. For the five critical fields, which routing checks on every intent, audited accuracy is 88.4%. For the sparse attribute fields, which routing does not check, agreement and correctness can diverge: the time field shows about 90% inter-model agreement against 45% human-validated accuracy (§7.1), because all three models shared an over-generation bias. This divergence is why the release pairs agreement statistics with the audit, and why the audit, not agreement, is the accuracy estimate to cite for sparse fields.</w:t>
-      </w:r>
-    </w:p>
-    <w:p>
-      <w:pPr>
-        <w:pStyle w:val="BodyText"/>
-        <w:jc w:val="both"/>
-        <w:keepNext w:val="0"/>
-        <w:keepLines w:val="0"/>
-        <w:widowControl w:val="1"/>
-      </w:pPr>
-      <w:r>
-        <w:t xml:space="preserve">The construction measurements have defined scope. Inter-model agreement is computed on 8 to 40 documents per corpus (Appendix A.1), with correspondingly wide intervals except in the scaled temperature-0 run (Appendix A.3); extending the scaled run to the remaining corpora is a direct next step. The medication arbiter applies to notes carrying structured admission and discharge medication lists, which the assessment-and-plan corpus does not include. Source annotations serve two roles, as evidence shown to annotators and as recall targets, so a no-source-hint ablation is the designated experiment for separating genuine recall from hint propagation.</w:t>
-      </w:r>
-    </w:p>
-    <w:p>
-      <w:pPr>
-        <w:pStyle w:val="BodyText"/>
-        <w:jc w:val="both"/>
-        <w:keepNext w:val="0"/>
-        <w:keepLines w:val="0"/>
-        <w:widowControl w:val="1"/>
-      </w:pPr>
-      <w:r>
-        <w:t xml:space="preserve">The main benchmark evaluates prompted models against the human gold (§7.2). Sonnet, Llama, and Nova contributed candidate labels during construction, so they are construction-involved references; the two gpt-oss models are the independent baselines (§4). A TF-IDF plus logistic-regression cross-corpus baseline (§7.5) establishes a clear transfer gap; a strong trainable-encoder baseline on the released split is future work.</w:t>
-      </w:r>
-    </w:p>
-    <w:p>
-      <w:pPr>
-        <w:pStyle w:val="BodyText"/>
-        <w:jc w:val="both"/>
-        <w:keepNext w:val="0"/>
-        <w:keepLines w:val="0"/>
-        <w:widowControl w:val="1"/>
-      </w:pPr>
-      <w:r>
-        <w:t xml:space="preserve">The gold standard is structured by field. All 2,145 intents are human-checked on the five critical fields; the six sparse fields are human-checked on a 300-intent audit, and target codes are not yet resolved in the gold (§7.4). Records are therefore core-field gold, with sparse-field and code quality quantified by the audits. Per-corpus notes, patients, intents, gold, and routing are reported in Table 6, with split sizes in §6; a full dataset card will add candidate-versus-clustered intent counts. On three corpora the retrospective, over-segmented source gold bounds measurable recovery of some source labels, a property we characterize in Appendix A.2.</w:t>
-      </w:r>
-    </w:p>
-    <w:p>
-      <w:pPr>
-        <w:pStyle w:val="BodyText"/>
-        <w:jc w:val="both"/>
-        <w:keepNext w:val="0"/>
-        <w:keepLines w:val="0"/>
-        <w:widowControl w:val="1"/>
-      </w:pPr>
-      <w:r>
-        <w:t xml:space="preserve">Span coverage has a measured ceiling. Spans come from the source anchors plus LLM extraction, so an intent missed by both the source corpora and the models goes uncounted; the exhaustive from-scratch pass of §7.6 estimates this miss rate at 3.6% on 24 notes (completeness 96.4%), and a larger exhaustive study will tighten the estimate.</w:t>
-      </w:r>
-    </w:p>
-    <w:p>
-      <w:pPr>
-        <w:pStyle w:val="BodyText"/>
-        <w:jc w:val="both"/>
-        <w:keepNext w:val="0"/>
-        <w:keepLines w:val="0"/>
-        <w:widowControl w:val="1"/>
-      </w:pPr>
-      <w:r>
-        <w:t xml:space="preserve">On standards and human validation, the released mapper emits schema-valid FHIR R4 resources for every mappable intent (§3.2); profile-conformance and terminology-binding validation are future work. Reliability is measured by a second annotator relabeling a 211-intent sample (§7.1, moderate-to-substantial kappa); full double annotation of the release and validation by expert clinicians are the next stages of the validation program.</w:t>
-      </w:r>
-    </w:p>
-    <w:bookmarkEnd w:id="45"/>
-    <w:bookmarkStart w:id="46" w:name="conclusion"/>
-    <w:p>
-      <w:pPr>
-        <w:pStyle w:val="Heading2"/>
-        <w:keepNext/>
-        <w:keepLines/>
-        <w:widowControl w:val="1"/>
-      </w:pPr>
-      <w:r>
-        <w:t xml:space="preserve">10</w:t>
-      </w:r>
-      <w:r>
-        <w:t xml:space="preserve"> </w:t>
-      </w:r>
-      <w:r>
-        <w:t xml:space="preserve">Conclusion</w:t>
-      </w:r>
-    </w:p>
-    <w:p>
-      <w:pPr>
-        <w:pStyle w:val="FirstParagraph"/>
-        <w:jc w:val="both"/>
-        <w:keepNext w:val="0"/>
-        <w:keepLines w:val="0"/>
-        <w:widowControl w:val="1"/>
-      </w:pPr>
-      <w:r>
-        <w:t xml:space="preserve">Prospective clinical intent is annotated in fragments across incompatible corpora. We defined the CIE task and a FHIR-informed representation that adds request-intent and modality as separate axes prior datasets do not jointly represent, and we release CIRCA, a harmonized dataset of 10,011 intents over 1,185 notes and 942 patients across five heterogeneous corpora and two note distributions, with a human-reviewed core of 2,145 validated intents plus 255 reviewed negatives, per-layer licensing, source-to-CIR crosswalks, and a schema-valid FHIR R4 mapper. The dataset is built by a three-model consensus that routes disagreements to human adjudication; the audited agreement stratum matches human judgment 88.4% of the time. Benchmarking five existing models against the human gold shows type is easy (85 to 91%) but the full structured label is not (18 to 35% all-four given the span), with action and modality the hardest fields. All artifacts are released; an exhaustive from-scratch whole-note gold set (§7.6) and a second-annotator reliability study (§7.1) are included; validation by expert clinicians remains future work.</w:t>
+        <w:t xml:space="preserve">. The deposit contains the CIR annotations, the source-to-CIR crosswalks, the per-note KART surrogate mappings, the modified KART code, the deterministic FHIR R4 mapper, the reference evaluator, and a rebuild script. It contains no source note text: the MIMIC-III-derived layers ship as stand-off annotations (character offsets and CIR fields keyed to MIMIC note identifiers) that a credentialed user rehydrates with the rebuild script and their own MIMIC-III access, and only the public ACI-Bench layer is distributed with its text. Use of the MIMIC-III-derived layers remains governed by the PhysioNet/MIMIC-III data-use agreement.</w:t>
       </w:r>
     </w:p>
     <w:p>
@@ -22501,57 +21139,8 @@
         </w:pict>
       </w:r>
     </w:p>
-    <w:bookmarkEnd w:id="46"/>
-    <w:bookmarkStart w:id="47" w:name="data-availability"/>
-    <w:p>
-      <w:pPr>
-        <w:pStyle w:val="Heading2"/>
-        <w:keepNext/>
-        <w:keepLines/>
-        <w:widowControl w:val="1"/>
-      </w:pPr>
-      <w:r>
-        <w:t xml:space="preserve"> </w:t>
-      </w:r>
-      <w:r>
-        <w:t xml:space="preserve">Data availability</w:t>
-      </w:r>
-    </w:p>
-    <w:p>
-      <w:pPr>
-        <w:pStyle w:val="FirstParagraph"/>
-        <w:jc w:val="both"/>
-        <w:keepNext w:val="0"/>
-        <w:keepLines w:val="0"/>
-        <w:widowControl w:val="1"/>
-      </w:pPr>
-      <w:r>
-        <w:t xml:space="preserve">CIRCA is archived on Zenodo at</w:t>
-      </w:r>
-      <w:r>
-        <w:t xml:space="preserve"> </w:t>
-      </w:r>
-      <w:hyperlink r:id="rId42">
-        <w:r>
-          <w:rPr>
-            <w:rStyle w:val="Hyperlink"/>
-          </w:rPr>
-          <w:t xml:space="preserve">https://doi.org/10.5281/zenodo.22058593</w:t>
-        </w:r>
-      </w:hyperlink>
-      <w:r>
-        <w:t xml:space="preserve">. The deposit contains the CIR annotations, the source-to-CIR crosswalks, the per-note KART surrogate mappings, the modified KART code, the deterministic FHIR R4 mapper, the reference evaluator, and a rebuild script. It contains no source note text: the MIMIC-III-derived layers ship as stand-off annotations (character offsets and CIR fields keyed to MIMIC note identifiers) that a credentialed user rehydrates with the rebuild script and their own MIMIC-III access, and only the public ACI-Bench layer is distributed with its text. Use of the MIMIC-III-derived layers remains governed by the PhysioNet/MIMIC-III data-use agreement.</w:t>
-      </w:r>
-    </w:p>
-    <w:p>
-      <w:r>
-        <w:pict>
-          <v:rect style="width:0;height:1.5pt" o:hralign="center" o:hrstd="t" o:hr="t"/>
-        </w:pict>
-      </w:r>
-    </w:p>
-    <w:bookmarkEnd w:id="47"/>
-    <w:bookmarkStart w:id="48" w:name="references"/>
+    <w:bookmarkEnd w:id="43"/>
+    <w:bookmarkStart w:id="44" w:name="references"/>
     <w:p>
       <w:pPr>
         <w:pStyle w:val="ReferencesHeading"/>
@@ -23561,8 +22150,8 @@
         </w:pict>
       </w:r>
     </w:p>
-    <w:bookmarkEnd w:id="48"/>
-    <w:bookmarkStart w:id="54" w:name="X804f4584502c385799e4eb5c26458f0fa239b0e"/>
+    <w:bookmarkEnd w:id="44"/>
+    <w:bookmarkStart w:id="50" w:name="X804f4584502c385799e4eb5c26458f0fa239b0e"/>
     <w:p>
       <w:pPr>
         <w:pStyle w:val="Heading2"/>
@@ -23577,7 +22166,7 @@
         <w:t xml:space="preserve">Appendix A. Construction and validation details</w:t>
       </w:r>
     </w:p>
-    <w:bookmarkStart w:id="49" w:name="a.1-inter-model-agreement"/>
+    <w:bookmarkStart w:id="45" w:name="a.1-inter-model-agreement"/>
     <w:p>
       <w:pPr>
         <w:pStyle w:val="Heading3"/>
@@ -24877,7 +23466,7 @@
     <w:p>
       <w:pPr>
         <w:pStyle w:val="TableCaption"/>
-        <w:spacing w:before="280" w:after="60" w:line="240" w:lineRule="auto"/>
+        <w:spacing w:before="40" w:after="40" w:line="240" w:lineRule="auto"/>
         <w:jc w:val="center"/>
         <w:keepNext/>
         <w:keepLines/>
@@ -24905,8 +23494,8 @@
         <w:t>Inter-model field agreement (%) on aligned clusters; representative runs of 8 to 40 documents per corpus. The action column reports two numbers: exact · polarity-preserving. Agreement on the core fields holds across both MIMIC discharge summaries and ACI-Bench dialogue-derived notes. A scaled temperature-0 run (Appendix A.3) narrows the intervals.</w:t>
       </w:r>
     </w:p>
-    <w:bookmarkEnd w:id="49"/>
-    <w:bookmarkStart w:id="50" w:name="a.2-recovery-of-source-gold"/>
+    <w:bookmarkEnd w:id="45"/>
+    <w:bookmarkStart w:id="46" w:name="a.2-recovery-of-source-gold"/>
     <w:p>
       <w:pPr>
         <w:pStyle w:val="Heading3"/>
@@ -25675,7 +24264,7 @@
     <w:p>
       <w:pPr>
         <w:pStyle w:val="TableCaption"/>
-        <w:spacing w:before="280" w:after="60" w:line="240" w:lineRule="auto"/>
+        <w:spacing w:before="40" w:after="40" w:line="240" w:lineRule="auto"/>
         <w:jc w:val="center"/>
         <w:keepNext/>
         <w:keepLines/>
@@ -25703,8 +24292,8 @@
         <w:t>Recall of each corpus's own gold labels (%). On the two corpora whose gold is discrete and prospective (ap_parsing, SIMORD), recall is 77 to 83% with 87 to 94% type accuracy. *Lower figures on CLIP, PaniniQA, and MedDec reflect source-gold granularity (over-segmented, retrospective, or past-care spans); source-gold recall is a lower bound on prospective-action recall, not a miss rate.</w:t>
       </w:r>
     </w:p>
-    <w:bookmarkEnd w:id="50"/>
-    <w:bookmarkStart w:id="51" w:name="a.3-decoding-and-confidence-intervals"/>
+    <w:bookmarkEnd w:id="46"/>
+    <w:bookmarkStart w:id="47" w:name="a.3-decoding-and-confidence-intervals"/>
     <w:p>
       <w:pPr>
         <w:pStyle w:val="Heading3"/>
@@ -25728,8 +24317,8 @@
         <w:t xml:space="preserve">Small annotation sets are noisy: one hard document can move an aggregate by ten points. We therefore report inter-model agreement with a document-level bootstrap confidence interval. Brackets in this subsection denote 95% bootstrap confidence intervals. At temperature 0 on a scaled run (ap_parsing, 20 documents, 169 clusters), agreement carries tight intervals: target 98% [96, 100], type 87% [82, 92], modality 94% [89, 98], and polarity-preserving action 88% [83, 92]. The same temperature-0 run gives an exact action agreement of 69% [60, 77]; exact agreement falls below the polarity-preserving rate because it penalizes the start-versus-continue flips that preserve the direction of care. We report exact action agreement as the primary action figure and the polarity-preserving rate as a secondary, clinical-severity-aware measure alongside it.</w:t>
       </w:r>
     </w:p>
-    <w:bookmarkEnd w:id="51"/>
-    <w:bookmarkStart w:id="52" w:name="a.4-deterministic-normalization-layers"/>
+    <w:bookmarkEnd w:id="47"/>
+    <w:bookmarkStart w:id="48" w:name="a.4-deterministic-normalization-layers"/>
     <w:p>
       <w:pPr>
         <w:pStyle w:val="Heading3"/>
@@ -25914,8 +24503,8 @@
         <w:t xml:space="preserve">Closed action vocabulary with synonym mapping, brand-to-generic target normalization, and coarse strength classes for the fine modality values that discharge language genuinely conflates.</w:t>
       </w:r>
     </w:p>
-    <w:bookmarkEnd w:id="52"/>
-    <w:bookmarkStart w:id="53" w:name="Xd695dd4ec1330c3df6277cac6d8b46b35f252e3"/>
+    <w:bookmarkEnd w:id="48"/>
+    <w:bookmarkStart w:id="49" w:name="Xd695dd4ec1330c3df6277cac6d8b46b35f252e3"/>
     <w:p>
       <w:pPr>
         <w:pStyle w:val="Heading3"/>
@@ -25965,6 +24554,1415 @@
       </w:pPr>
       <w:r>
         <w:t xml:space="preserve">Component attribution uses leave-one-out paired-delta testing: a component counts as an improvement only when the paired confidence interval of its effect excludes zero. The code-aware cannot-link constraint splits clusters whose members carry conflicting standard codes, correcting spuriously high agreement. The medication arbiter unifies the action label across models, so we validate it against human gold: on the 1,221 medication intents in the validated set, action accuracy is 85% both before and after, because start versus continue is decided by the admission medication list the arbiter reads but the span-level annotator did not see. Its contribution is cross-model consistency at unchanged accuracy.</w:t>
+      </w:r>
+    </w:p>
+    <w:bookmarkEnd w:id="49"/>
+    <w:bookmarkEnd w:id="50"/>
+    <w:bookmarkStart w:id="54" w:name="X94d5ed5794d51e4461f7f83c627597c5e3c8ca1"/>
+    <w:p>
+      <w:pPr>
+        <w:pStyle w:val="Heading2"/>
+        <w:keepNext/>
+        <w:keepLines/>
+        <w:widowControl w:val="1"/>
+      </w:pPr>
+      <w:r>
+        <w:t xml:space="preserve"> </w:t>
+      </w:r>
+      <w:r>
+        <w:t xml:space="preserve">Appendix B. Access, provenance, and licensing</w:t>
+      </w:r>
+    </w:p>
+    <w:bookmarkStart w:id="51" w:name="b.1-intended-uses"/>
+    <w:p>
+      <w:pPr>
+        <w:pStyle w:val="Heading3"/>
+        <w:keepNext/>
+        <w:keepLines/>
+        <w:widowControl w:val="1"/>
+      </w:pPr>
+      <w:r>
+        <w:t xml:space="preserve">B.1 Intended uses</w:t>
+      </w:r>
+    </w:p>
+    <w:p>
+      <w:pPr>
+        <w:pStyle w:val="FirstParagraph"/>
+        <w:jc w:val="both"/>
+        <w:keepNext w:val="0"/>
+        <w:keepLines w:val="0"/>
+        <w:widowControl w:val="1"/>
+      </w:pPr>
+      <w:r>
+        <w:t xml:space="preserve">CIRCA supports three things the source corpora cannot do individually: extract prospective actions with their authority and clinical strength under one label space; transfer across annotation schemes and note types; and test whether models preserve clinically consequential distinctions such as conditional-versus-active and prohibited-versus-recommended. The provenance tiers add a fourth: training on the full 10,011-intent resource while evaluating on the human-reviewed core, or studying robustness to silver-label noise. Three concrete uses motivate the release.</w:t>
+      </w:r>
+      <w:r>
+        <w:t xml:space="preserve"> </w:t>
+      </w:r>
+      <w:r>
+        <w:rPr>
+          <w:b/>
+          <w:bCs/>
+        </w:rPr>
+        <w:t xml:space="preserve">(a) Lost-to-follow-up safety:</w:t>
+      </w:r>
+      <w:r>
+        <w:t xml:space="preserve"> </w:t>
+      </w:r>
+      <w:r>
+        <w:t xml:space="preserve">annotations with a validated timing value become trackable deadlines, and the modality axis lets a tracker suppress reminders for prohibited or not-yet-triggered conditional intents; an untracked "repeat CT in 3 months if the nodule persists" is exactly the failure mode behind missed-follow-up harm.</w:t>
+      </w:r>
+      <w:r>
+        <w:t xml:space="preserve"> </w:t>
+      </w:r>
+      <w:r>
+        <w:rPr>
+          <w:b/>
+          <w:bCs/>
+        </w:rPr>
+        <w:t xml:space="preserve">(b) FHIR request-resource serialization:</w:t>
+      </w:r>
+      <w:r>
+        <w:t xml:space="preserve"> </w:t>
+      </w:r>
+      <w:r>
+        <w:t xml:space="preserve">request-intent maps to FHIR RequestIntent and the coded target to the resource, so a CIR record fills in a ServiceRequest, MedicationRequest, or CommunicationRequest entry.</w:t>
+      </w:r>
+      <w:r>
+        <w:t xml:space="preserve"> </w:t>
+      </w:r>
+      <w:r>
+        <w:rPr>
+          <w:b/>
+          <w:bCs/>
+        </w:rPr>
+        <w:t xml:space="preserve">(c) Cross-corpus robustness:</w:t>
+      </w:r>
+      <w:r>
+        <w:t xml:space="preserve"> </w:t>
+      </w:r>
+      <w:r>
+        <w:t xml:space="preserve">the five-corpus, two-distribution design supports training on discharge summaries and testing on dialogue-derived notes, an evaluation only a harmonized resource enables.</w:t>
+      </w:r>
+    </w:p>
+    <w:p>
+      <w:pPr>
+        <w:pStyle w:val="BodyText"/>
+        <w:jc w:val="both"/>
+        <w:keepNext w:val="0"/>
+        <w:keepLines w:val="0"/>
+        <w:widowControl w:val="1"/>
+      </w:pPr>
+      <w:r>
+        <w:t xml:space="preserve">CIR output is a structured extraction, not a clinical order, and schema validity is not clinical correctness: an erroneous extraction of a prohibited or conditional action could cause harm if consumed unchecked. The resource is intended for research and system development, not autonomous clinical use.</w:t>
+      </w:r>
+    </w:p>
+    <w:bookmarkEnd w:id="51"/>
+    <w:bookmarkStart w:id="52" w:name="b.2-data-provenance-and-compliance"/>
+    <w:p>
+      <w:pPr>
+        <w:pStyle w:val="Heading3"/>
+        <w:keepNext/>
+        <w:keepLines/>
+        <w:widowControl w:val="1"/>
+      </w:pPr>
+      <w:r>
+        <w:t xml:space="preserve">B.2 Data provenance and compliance</w:t>
+      </w:r>
+    </w:p>
+    <w:p>
+      <w:pPr>
+        <w:pStyle w:val="FirstParagraph"/>
+        <w:jc w:val="both"/>
+        <w:keepNext w:val="0"/>
+        <w:keepLines w:val="0"/>
+        <w:widowControl w:val="1"/>
+      </w:pPr>
+      <w:r>
+        <w:t xml:space="preserve">Every intent in CIRCA traces to its source note and to the policy under which that note was handled.</w:t>
+      </w:r>
+    </w:p>
+    <w:p>
+      <w:pPr>
+        <w:pStyle w:val="BodyText"/>
+        <w:jc w:val="both"/>
+        <w:keepNext w:val="0"/>
+        <w:keepLines w:val="0"/>
+        <w:widowControl w:val="1"/>
+      </w:pPr>
+      <w:r>
+        <w:rPr>
+          <w:b/>
+          <w:bCs/>
+        </w:rPr>
+        <w:t xml:space="preserve">Sources.</w:t>
+      </w:r>
+      <w:r>
+        <w:t xml:space="preserve"> </w:t>
+      </w:r>
+      <w:r>
+        <w:t xml:space="preserve">Four corpora (CLIP, MedDec, ap_parsing, PaniniQA) annotate MIMIC-III notes, protected clinical records available only under credentialed PhysioNet access and the MIMIC-III data-use agreement (DUA). The fifth, ACI-Bench, is public, simulated doctor-patient dialogue and contains no real patient data.</w:t>
+      </w:r>
+    </w:p>
+    <w:p>
+      <w:pPr>
+        <w:pStyle w:val="BodyText"/>
+        <w:jc w:val="both"/>
+        <w:keepNext w:val="0"/>
+        <w:keepLines w:val="0"/>
+        <w:widowControl w:val="1"/>
+      </w:pPr>
+      <w:r>
+        <w:rPr>
+          <w:b/>
+          <w:bCs/>
+        </w:rPr>
+        <w:t xml:space="preserve">Processing.</w:t>
+      </w:r>
+      <w:r>
+        <w:t xml:space="preserve"> </w:t>
+      </w:r>
+      <w:r>
+        <w:t xml:space="preserve">The notes were never sent to an uncontrolled model endpoint: every annotation-model call ran through Amazon Web Services (AWS) Bedrock under a HIPAA Business Associate Agreement (BAA), on a zero-retention configuration under which no prompt or model output is stored once a request completes. MIMIC-III is de-identified, so a BAA is not strictly required for it; we adopt one as an additional contractual safeguard. This covers the processing infrastructure only and is applied on top of, not in place of, each source corpus's own DUA.</w:t>
+      </w:r>
+    </w:p>
+    <w:p>
+      <w:pPr>
+        <w:pStyle w:val="BodyText"/>
+        <w:jc w:val="both"/>
+        <w:keepNext w:val="0"/>
+        <w:keepLines w:val="0"/>
+        <w:widowControl w:val="1"/>
+      </w:pPr>
+      <w:r>
+        <w:rPr>
+          <w:b/>
+          <w:bCs/>
+        </w:rPr>
+        <w:t xml:space="preserve">De-identification handling (KART).</w:t>
+      </w:r>
+      <w:r>
+        <w:t xml:space="preserve"> </w:t>
+      </w:r>
+      <w:r>
+        <w:t xml:space="preserve">MIMIC notes carry de-identification placeholders (for example</w:t>
+      </w:r>
+      <w:r>
+        <w:t xml:space="preserve"> </w:t>
+      </w:r>
+      <w:r>
+        <w:rPr>
+          <w:rStyle w:val="VerbatimChar"/>
+        </w:rPr>
+        <w:t xml:space="preserve">[**Last Name**]</w:t>
+      </w:r>
+      <w:r>
+        <w:t xml:space="preserve"> </w:t>
+      </w:r>
+      <w:r>
+        <w:t xml:space="preserve">or</w:t>
+      </w:r>
+      <w:r>
+        <w:t xml:space="preserve"> </w:t>
+      </w:r>
+      <w:r>
+        <w:rPr>
+          <w:rStyle w:val="VerbatimChar"/>
+        </w:rPr>
+        <w:t xml:space="preserve">[**2118-6-2**]</w:t>
+      </w:r>
+      <w:r>
+        <w:t xml:space="preserve">) where identifiers were removed. Passing these to a model degrades reading and destroys the time structure that timing extraction depends on, so before model processing we fill each placeholder with a realistic, deterministic surrogate using KART, a surrogate filler extended for discharge summaries and released with the code. KART classifies every placeholder against the PhysioNet de-identification tag grammar and substitutes a synthetic value under two invariants:</w:t>
+      </w:r>
+      <w:r>
+        <w:t xml:space="preserve"> </w:t>
+      </w:r>
+      <w:r>
+        <w:rPr>
+          <w:i/>
+          <w:iCs/>
+        </w:rPr>
+        <w:t xml:space="preserve">consistency</w:t>
+      </w:r>
+      <w:r>
+        <w:t xml:space="preserve"> </w:t>
+      </w:r>
+      <w:r>
+        <w:t xml:space="preserve">(a given placeholder maps to the same surrogate throughout a note) and</w:t>
+      </w:r>
+      <w:r>
+        <w:t xml:space="preserve"> </w:t>
+      </w:r>
+      <w:r>
+        <w:rPr>
+          <w:i/>
+          <w:iCs/>
+        </w:rPr>
+        <w:t xml:space="preserve">interval preservation</w:t>
+      </w:r>
+      <w:r>
+        <w:t xml:space="preserve"> </w:t>
+      </w:r>
+      <w:r>
+        <w:t xml:space="preserve">(all full dates in a note shift by one shared year offset, keeping month and day, so the gaps between dated events are preserved for timing extraction). The released version handles the failure modes a discharge corpus exposes, including date-label echoing, numeric-identifier misrouting, a dedicated initials surrogate, and distinct surrogate names for id-less clinician mentions while protecting the patient's own name; across 100 notes and 4,632 placeholders none was left unclassified. Surrogate values are synthetic and carry no real identifiers; the underlying clinical text remains MIMIC-derived and is processed only under the BAA path above.</w:t>
+      </w:r>
+    </w:p>
+    <w:p>
+      <w:pPr>
+        <w:pStyle w:val="BodyText"/>
+        <w:jc w:val="both"/>
+        <w:keepNext w:val="0"/>
+        <w:keepLines w:val="0"/>
+        <w:widowControl w:val="1"/>
+      </w:pPr>
+      <w:r>
+        <w:rPr>
+          <w:b/>
+          <w:bCs/>
+        </w:rPr>
+        <w:t xml:space="preserve">Release.</w:t>
+      </w:r>
+      <w:r>
+        <w:t xml:space="preserve"> </w:t>
+      </w:r>
+      <w:r>
+        <w:t xml:space="preserve">We publish only derived artifacts, never source note text: the CIR labels and annotations, the source-to-CIR crosswalks, and the per-note KART surrogate mappings. The MIMIC-derived layers ship as stand-off annotations, character offsets and CIR fields keyed to MIMIC note identifiers, together with the surrogate mapping (placeholder offsets and their synthetic fills) and a rebuild script that regenerates the exact text the models read for a user who already holds credentialed MIMIC access (Table 15). Only the ACI-Bench layer, built on public text, is released with its note text.</w:t>
+      </w:r>
+    </w:p>
+    <w:bookmarkEnd w:id="52"/>
+    <w:bookmarkStart w:id="53" w:name="b.3-availability-and-licensing"/>
+    <w:p>
+      <w:pPr>
+        <w:pStyle w:val="Heading3"/>
+        <w:keepNext/>
+        <w:keepLines/>
+        <w:widowControl w:val="1"/>
+      </w:pPr>
+      <w:r>
+        <w:t xml:space="preserve">B.3 Availability and licensing</w:t>
+      </w:r>
+    </w:p>
+    <w:p>
+      <w:pPr>
+        <w:pStyle w:val="FirstParagraph"/>
+        <w:jc w:val="both"/>
+        <w:keepNext w:val="0"/>
+        <w:keepLines w:val="0"/>
+        <w:widowControl w:val="1"/>
+      </w:pPr>
+      <w:r>
+        <w:t xml:space="preserve">The deposit ships as stand-off CIR records in JSONL, one object per intent with a note identifier, character-offset provenance, and all CIR fields, together with the crosswalks, the KART surrogate mappings, the deterministic FHIR mapper, and the reference evaluator. Each layer inherits the license and data-use agreement of its source corpus (Table 15): the combined resource does not carry a single uniform license. The complete deposit is archived on Zenodo at</w:t>
+      </w:r>
+      <w:r>
+        <w:t xml:space="preserve"> </w:t>
+      </w:r>
+      <w:hyperlink r:id="rId42">
+        <w:r>
+          <w:rPr>
+            <w:rStyle w:val="Hyperlink"/>
+          </w:rPr>
+          <w:t xml:space="preserve">https://doi.org/10.5281/zenodo.22058593</w:t>
+        </w:r>
+      </w:hyperlink>
+      <w:r>
+        <w:t xml:space="preserve">.</w:t>
+      </w:r>
+    </w:p>
+    <w:tbl>
+      <w:tblPr>
+        <w:tblStyle w:val="Table"/>
+        <w:tblW w:type="pct" w:w="5000"/>
+        <w:jc w:val="center"/>
+        <w:tblLook w:firstRow="1" w:lastRow="0" w:firstColumn="0" w:lastColumn="0" w:noHBand="0" w:noVBand="0" w:val="0020"/>
+        <w:tblLayout w:type="autofit"/>
+        <w:tblBorders>
+          <w:top w:val="single" w:sz="10" w:color="4F6272"/>
+          <w:bottom w:val="single" w:sz="10" w:color="4F6272"/>
+          <w:insideH w:val="single" w:sz="5" w:color="9FB0C2"/>
+          <w:left w:val="single" w:sz="6" w:color="9FB0C2"/>
+          <w:right w:val="single" w:sz="6" w:color="9FB0C2"/>
+          <w:insideV w:val="single" w:sz="5" w:color="D9E1E8"/>
+        </w:tblBorders>
+      </w:tblPr>
+      <w:tblGrid>
+        <w:gridCol w:w="1584"/>
+        <w:gridCol w:w="1584"/>
+        <w:gridCol w:w="1584"/>
+        <w:gridCol w:w="1584"/>
+        <w:gridCol w:w="1584"/>
+      </w:tblGrid>
+      <w:tr>
+        <w:trPr>
+          <w:tblHeader w:val="on"/>
+        </w:trPr>
+        <w:tc>
+          <w:tcPr>
+            <w:shd w:fill="EEF3F7"/>
+            <w:tcBorders>
+              <w:left w:val="nil"/>
+              <w:right w:val="nil"/>
+              <w:top w:val="nil"/>
+              <w:bottom w:val="single" w:sz="8" w:color="9FB0C2"/>
+            </w:tcBorders>
+            <w:vAlign w:val="center"/>
+          </w:tcPr>
+          <w:p>
+            <w:pPr>
+              <w:pStyle w:val="Compact"/>
+              <w:spacing w:before="0" w:after="20" w:line="240" w:lineRule="auto"/>
+              <w:jc w:val="center"/>
+              <w:suppressAutoHyphens/>
+              <w:keepNext w:val="0"/>
+              <w:keepLines/>
+              <w:widowControl w:val="1"/>
+            </w:pPr>
+            <w:r>
+              <w:rPr>
+                <w:rFonts w:ascii="Times New Roman" w:hAnsi="Times New Roman"/>
+                <w:b/>
+                <w:sz w:val="19"/>
+              </w:rPr>
+              <w:t xml:space="preserve">Layer</w:t>
+            </w:r>
+          </w:p>
+        </w:tc>
+        <w:tc>
+          <w:tcPr>
+            <w:shd w:fill="EEF3F7"/>
+            <w:tcBorders>
+              <w:left w:val="nil"/>
+              <w:right w:val="nil"/>
+              <w:top w:val="nil"/>
+              <w:bottom w:val="single" w:sz="8" w:color="9FB0C2"/>
+            </w:tcBorders>
+            <w:vAlign w:val="center"/>
+          </w:tcPr>
+          <w:p>
+            <w:pPr>
+              <w:pStyle w:val="Compact"/>
+              <w:spacing w:before="0" w:after="20" w:line="240" w:lineRule="auto"/>
+              <w:jc w:val="center"/>
+              <w:suppressAutoHyphens/>
+              <w:keepNext w:val="0"/>
+              <w:keepLines/>
+              <w:widowControl w:val="1"/>
+            </w:pPr>
+            <w:r>
+              <w:rPr>
+                <w:rFonts w:ascii="Times New Roman" w:hAnsi="Times New Roman"/>
+                <w:b/>
+                <w:sz w:val="19"/>
+              </w:rPr>
+              <w:t xml:space="preserve">underlying-text rights</w:t>
+            </w:r>
+          </w:p>
+        </w:tc>
+        <w:tc>
+          <w:tcPr>
+            <w:shd w:fill="EEF3F7"/>
+            <w:tcBorders>
+              <w:left w:val="nil"/>
+              <w:right w:val="nil"/>
+              <w:top w:val="nil"/>
+              <w:bottom w:val="single" w:sz="8" w:color="9FB0C2"/>
+            </w:tcBorders>
+            <w:vAlign w:val="center"/>
+          </w:tcPr>
+          <w:p>
+            <w:pPr>
+              <w:pStyle w:val="Compact"/>
+              <w:spacing w:before="0" w:after="20" w:line="240" w:lineRule="auto"/>
+              <w:jc w:val="center"/>
+              <w:suppressAutoHyphens/>
+              <w:keepNext w:val="0"/>
+              <w:keepLines/>
+              <w:widowControl w:val="1"/>
+            </w:pPr>
+            <w:r>
+              <w:rPr>
+                <w:rFonts w:ascii="Times New Roman" w:hAnsi="Times New Roman"/>
+                <w:b/>
+                <w:sz w:val="19"/>
+              </w:rPr>
+              <w:t xml:space="preserve">annotation license</w:t>
+            </w:r>
+          </w:p>
+        </w:tc>
+        <w:tc>
+          <w:tcPr>
+            <w:shd w:fill="EEF3F7"/>
+            <w:tcBorders>
+              <w:left w:val="nil"/>
+              <w:right w:val="nil"/>
+              <w:top w:val="nil"/>
+              <w:bottom w:val="single" w:sz="8" w:color="9FB0C2"/>
+            </w:tcBorders>
+            <w:vAlign w:val="center"/>
+          </w:tcPr>
+          <w:p>
+            <w:pPr>
+              <w:pStyle w:val="Compact"/>
+              <w:spacing w:before="0" w:after="20" w:line="240" w:lineRule="auto"/>
+              <w:jc w:val="center"/>
+              <w:suppressAutoHyphens/>
+              <w:keepNext w:val="0"/>
+              <w:keepLines/>
+              <w:widowControl w:val="1"/>
+            </w:pPr>
+            <w:r>
+              <w:rPr>
+                <w:rFonts w:ascii="Times New Roman" w:hAnsi="Times New Roman"/>
+                <w:b/>
+                <w:sz w:val="19"/>
+              </w:rPr>
+              <w:t xml:space="preserve">redistributable?</w:t>
+            </w:r>
+          </w:p>
+        </w:tc>
+        <w:tc>
+          <w:tcPr>
+            <w:shd w:fill="EEF3F7"/>
+            <w:tcBorders>
+              <w:left w:val="nil"/>
+              <w:right w:val="nil"/>
+              <w:top w:val="nil"/>
+              <w:bottom w:val="single" w:sz="8" w:color="9FB0C2"/>
+            </w:tcBorders>
+            <w:vAlign w:val="center"/>
+          </w:tcPr>
+          <w:p>
+            <w:pPr>
+              <w:pStyle w:val="Compact"/>
+              <w:spacing w:before="0" w:after="20" w:line="240" w:lineRule="auto"/>
+              <w:jc w:val="center"/>
+              <w:suppressAutoHyphens/>
+              <w:keepNext w:val="0"/>
+              <w:keepLines/>
+              <w:widowControl w:val="1"/>
+            </w:pPr>
+            <w:r>
+              <w:rPr>
+                <w:rFonts w:ascii="Times New Roman" w:hAnsi="Times New Roman"/>
+                <w:b/>
+                <w:sz w:val="19"/>
+              </w:rPr>
+              <w:t xml:space="preserve">access mechanism</w:t>
+            </w:r>
+          </w:p>
+        </w:tc>
+      </w:tr>
+      <w:tr>
+        <w:tc>
+          <w:tcPr>
+            <w:tcBorders>
+              <w:left w:val="nil"/>
+              <w:right w:val="nil"/>
+              <w:top w:val="nil"/>
+              <w:bottom w:val="single" w:sz="4" w:color="D9E1E8"/>
+            </w:tcBorders>
+            <w:vAlign w:val="center"/>
+          </w:tcPr>
+          <w:p>
+            <w:pPr>
+              <w:pStyle w:val="Compact"/>
+              <w:spacing w:before="0" w:after="20" w:line="240" w:lineRule="auto"/>
+              <w:jc w:val="center"/>
+              <w:suppressAutoHyphens/>
+              <w:keepNext w:val="0"/>
+              <w:keepLines/>
+              <w:widowControl w:val="1"/>
+            </w:pPr>
+            <w:r>
+              <w:rPr>
+                <w:rFonts w:ascii="Times New Roman" w:hAnsi="Times New Roman"/>
+                <w:sz w:val="19"/>
+              </w:rPr>
+              <w:t xml:space="preserve">CLIP</w:t>
+            </w:r>
+          </w:p>
+        </w:tc>
+        <w:tc>
+          <w:tcPr>
+            <w:tcBorders>
+              <w:left w:val="nil"/>
+              <w:right w:val="nil"/>
+              <w:top w:val="nil"/>
+              <w:bottom w:val="single" w:sz="4" w:color="D9E1E8"/>
+            </w:tcBorders>
+            <w:vAlign w:val="center"/>
+          </w:tcPr>
+          <w:p>
+            <w:pPr>
+              <w:pStyle w:val="Compact"/>
+              <w:spacing w:before="0" w:after="20" w:line="240" w:lineRule="auto"/>
+              <w:jc w:val="center"/>
+              <w:suppressAutoHyphens/>
+              <w:keepNext w:val="0"/>
+              <w:keepLines/>
+              <w:widowControl w:val="1"/>
+            </w:pPr>
+            <w:r>
+              <w:rPr>
+                <w:rFonts w:ascii="Times New Roman" w:hAnsi="Times New Roman"/>
+                <w:sz w:val="19"/>
+              </w:rPr>
+              <w:t xml:space="preserve">MIMIC-III (PhysioNet DUA)</w:t>
+            </w:r>
+          </w:p>
+        </w:tc>
+        <w:tc>
+          <w:tcPr>
+            <w:tcBorders>
+              <w:left w:val="nil"/>
+              <w:right w:val="nil"/>
+              <w:top w:val="nil"/>
+              <w:bottom w:val="single" w:sz="4" w:color="D9E1E8"/>
+            </w:tcBorders>
+            <w:vAlign w:val="center"/>
+          </w:tcPr>
+          <w:p>
+            <w:pPr>
+              <w:pStyle w:val="Compact"/>
+              <w:spacing w:before="0" w:after="20" w:line="240" w:lineRule="auto"/>
+              <w:jc w:val="center"/>
+              <w:suppressAutoHyphens/>
+              <w:keepNext w:val="0"/>
+              <w:keepLines/>
+              <w:widowControl w:val="1"/>
+            </w:pPr>
+            <w:r>
+              <w:rPr>
+                <w:rFonts w:ascii="Times New Roman" w:hAnsi="Times New Roman"/>
+                <w:sz w:val="19"/>
+              </w:rPr>
+              <w:t xml:space="preserve">source corpus license</w:t>
+            </w:r>
+          </w:p>
+        </w:tc>
+        <w:tc>
+          <w:tcPr>
+            <w:tcBorders>
+              <w:left w:val="nil"/>
+              <w:right w:val="nil"/>
+              <w:top w:val="nil"/>
+              <w:bottom w:val="single" w:sz="4" w:color="D9E1E8"/>
+            </w:tcBorders>
+            <w:vAlign w:val="center"/>
+          </w:tcPr>
+          <w:p>
+            <w:pPr>
+              <w:pStyle w:val="Compact"/>
+              <w:spacing w:before="0" w:after="20" w:line="240" w:lineRule="auto"/>
+              <w:jc w:val="center"/>
+              <w:suppressAutoHyphens/>
+              <w:keepNext w:val="0"/>
+              <w:keepLines/>
+              <w:widowControl w:val="1"/>
+            </w:pPr>
+            <w:r>
+              <w:rPr>
+                <w:rFonts w:ascii="Times New Roman" w:hAnsi="Times New Roman"/>
+                <w:sz w:val="19"/>
+              </w:rPr>
+              <w:t xml:space="preserve">annotations only, no MIMIC text</w:t>
+            </w:r>
+          </w:p>
+        </w:tc>
+        <w:tc>
+          <w:tcPr>
+            <w:tcBorders>
+              <w:left w:val="nil"/>
+              <w:right w:val="nil"/>
+              <w:top w:val="nil"/>
+              <w:bottom w:val="single" w:sz="4" w:color="D9E1E8"/>
+            </w:tcBorders>
+            <w:vAlign w:val="center"/>
+          </w:tcPr>
+          <w:p>
+            <w:pPr>
+              <w:pStyle w:val="Compact"/>
+              <w:spacing w:before="0" w:after="20" w:line="240" w:lineRule="auto"/>
+              <w:jc w:val="center"/>
+              <w:suppressAutoHyphens/>
+              <w:keepNext w:val="0"/>
+              <w:keepLines/>
+              <w:widowControl w:val="1"/>
+            </w:pPr>
+            <w:r>
+              <w:rPr>
+                <w:rFonts w:ascii="Times New Roman" w:hAnsi="Times New Roman"/>
+                <w:sz w:val="19"/>
+              </w:rPr>
+              <w:t xml:space="preserve">PhysioNet credentialed + rebuild script</w:t>
+            </w:r>
+          </w:p>
+        </w:tc>
+      </w:tr>
+      <w:tr>
+        <w:tc>
+          <w:tcPr>
+            <w:tcBorders>
+              <w:left w:val="nil"/>
+              <w:right w:val="nil"/>
+              <w:top w:val="nil"/>
+              <w:bottom w:val="single" w:sz="4" w:color="D9E1E8"/>
+            </w:tcBorders>
+            <w:vAlign w:val="center"/>
+          </w:tcPr>
+          <w:p>
+            <w:pPr>
+              <w:pStyle w:val="Compact"/>
+              <w:spacing w:before="0" w:after="20" w:line="240" w:lineRule="auto"/>
+              <w:jc w:val="center"/>
+              <w:suppressAutoHyphens/>
+              <w:keepNext w:val="0"/>
+              <w:keepLines/>
+              <w:widowControl w:val="1"/>
+            </w:pPr>
+            <w:r>
+              <w:rPr>
+                <w:rFonts w:ascii="Times New Roman" w:hAnsi="Times New Roman"/>
+                <w:sz w:val="19"/>
+              </w:rPr>
+              <w:t xml:space="preserve">MedDec</w:t>
+            </w:r>
+          </w:p>
+        </w:tc>
+        <w:tc>
+          <w:tcPr>
+            <w:tcBorders>
+              <w:left w:val="nil"/>
+              <w:right w:val="nil"/>
+              <w:top w:val="nil"/>
+              <w:bottom w:val="single" w:sz="4" w:color="D9E1E8"/>
+            </w:tcBorders>
+            <w:vAlign w:val="center"/>
+          </w:tcPr>
+          <w:p>
+            <w:pPr>
+              <w:pStyle w:val="Compact"/>
+              <w:spacing w:before="0" w:after="20" w:line="240" w:lineRule="auto"/>
+              <w:jc w:val="center"/>
+              <w:suppressAutoHyphens/>
+              <w:keepNext w:val="0"/>
+              <w:keepLines/>
+              <w:widowControl w:val="1"/>
+            </w:pPr>
+            <w:r>
+              <w:rPr>
+                <w:rFonts w:ascii="Times New Roman" w:hAnsi="Times New Roman"/>
+                <w:sz w:val="19"/>
+              </w:rPr>
+              <w:t xml:space="preserve">MIMIC-III (PhysioNet DUA)</w:t>
+            </w:r>
+          </w:p>
+        </w:tc>
+        <w:tc>
+          <w:tcPr>
+            <w:tcBorders>
+              <w:left w:val="nil"/>
+              <w:right w:val="nil"/>
+              <w:top w:val="nil"/>
+              <w:bottom w:val="single" w:sz="4" w:color="D9E1E8"/>
+            </w:tcBorders>
+            <w:vAlign w:val="center"/>
+          </w:tcPr>
+          <w:p>
+            <w:pPr>
+              <w:pStyle w:val="Compact"/>
+              <w:spacing w:before="0" w:after="20" w:line="240" w:lineRule="auto"/>
+              <w:jc w:val="center"/>
+              <w:suppressAutoHyphens/>
+              <w:keepNext w:val="0"/>
+              <w:keepLines/>
+              <w:widowControl w:val="1"/>
+            </w:pPr>
+            <w:r>
+              <w:rPr>
+                <w:rFonts w:ascii="Times New Roman" w:hAnsi="Times New Roman"/>
+                <w:sz w:val="19"/>
+              </w:rPr>
+              <w:t xml:space="preserve">source corpus license</w:t>
+            </w:r>
+          </w:p>
+        </w:tc>
+        <w:tc>
+          <w:tcPr>
+            <w:tcBorders>
+              <w:left w:val="nil"/>
+              <w:right w:val="nil"/>
+              <w:top w:val="nil"/>
+              <w:bottom w:val="single" w:sz="4" w:color="D9E1E8"/>
+            </w:tcBorders>
+            <w:vAlign w:val="center"/>
+          </w:tcPr>
+          <w:p>
+            <w:pPr>
+              <w:pStyle w:val="Compact"/>
+              <w:spacing w:before="0" w:after="20" w:line="240" w:lineRule="auto"/>
+              <w:jc w:val="center"/>
+              <w:suppressAutoHyphens/>
+              <w:keepNext w:val="0"/>
+              <w:keepLines/>
+              <w:widowControl w:val="1"/>
+            </w:pPr>
+            <w:r>
+              <w:rPr>
+                <w:rFonts w:ascii="Times New Roman" w:hAnsi="Times New Roman"/>
+                <w:sz w:val="19"/>
+              </w:rPr>
+              <w:t xml:space="preserve">annotations only, no MIMIC text</w:t>
+            </w:r>
+          </w:p>
+        </w:tc>
+        <w:tc>
+          <w:tcPr>
+            <w:tcBorders>
+              <w:left w:val="nil"/>
+              <w:right w:val="nil"/>
+              <w:top w:val="nil"/>
+              <w:bottom w:val="single" w:sz="4" w:color="D9E1E8"/>
+            </w:tcBorders>
+            <w:vAlign w:val="center"/>
+          </w:tcPr>
+          <w:p>
+            <w:pPr>
+              <w:pStyle w:val="Compact"/>
+              <w:spacing w:before="0" w:after="20" w:line="240" w:lineRule="auto"/>
+              <w:jc w:val="center"/>
+              <w:suppressAutoHyphens/>
+              <w:keepNext w:val="0"/>
+              <w:keepLines/>
+              <w:widowControl w:val="1"/>
+            </w:pPr>
+            <w:r>
+              <w:rPr>
+                <w:rFonts w:ascii="Times New Roman" w:hAnsi="Times New Roman"/>
+                <w:sz w:val="19"/>
+              </w:rPr>
+              <w:t xml:space="preserve">PhysioNet credentialed + rebuild script</w:t>
+            </w:r>
+          </w:p>
+        </w:tc>
+      </w:tr>
+      <w:tr>
+        <w:tc>
+          <w:tcPr>
+            <w:tcBorders>
+              <w:left w:val="nil"/>
+              <w:right w:val="nil"/>
+              <w:top w:val="nil"/>
+              <w:bottom w:val="single" w:sz="4" w:color="D9E1E8"/>
+            </w:tcBorders>
+            <w:vAlign w:val="center"/>
+          </w:tcPr>
+          <w:p>
+            <w:pPr>
+              <w:pStyle w:val="Compact"/>
+              <w:spacing w:before="0" w:after="20" w:line="240" w:lineRule="auto"/>
+              <w:jc w:val="center"/>
+              <w:suppressAutoHyphens/>
+              <w:keepNext w:val="0"/>
+              <w:keepLines/>
+              <w:widowControl w:val="1"/>
+            </w:pPr>
+            <w:r>
+              <w:rPr>
+                <w:rFonts w:ascii="Times New Roman" w:hAnsi="Times New Roman"/>
+                <w:sz w:val="19"/>
+              </w:rPr>
+              <w:t xml:space="preserve">ap_parsing</w:t>
+            </w:r>
+          </w:p>
+        </w:tc>
+        <w:tc>
+          <w:tcPr>
+            <w:tcBorders>
+              <w:left w:val="nil"/>
+              <w:right w:val="nil"/>
+              <w:top w:val="nil"/>
+              <w:bottom w:val="single" w:sz="4" w:color="D9E1E8"/>
+            </w:tcBorders>
+            <w:vAlign w:val="center"/>
+          </w:tcPr>
+          <w:p>
+            <w:pPr>
+              <w:pStyle w:val="Compact"/>
+              <w:spacing w:before="0" w:after="20" w:line="240" w:lineRule="auto"/>
+              <w:jc w:val="center"/>
+              <w:suppressAutoHyphens/>
+              <w:keepNext w:val="0"/>
+              <w:keepLines/>
+              <w:widowControl w:val="1"/>
+            </w:pPr>
+            <w:r>
+              <w:rPr>
+                <w:rFonts w:ascii="Times New Roman" w:hAnsi="Times New Roman"/>
+                <w:sz w:val="19"/>
+              </w:rPr>
+              <w:t xml:space="preserve">MIMIC-III (PhysioNet DUA)</w:t>
+            </w:r>
+          </w:p>
+        </w:tc>
+        <w:tc>
+          <w:tcPr>
+            <w:tcBorders>
+              <w:left w:val="nil"/>
+              <w:right w:val="nil"/>
+              <w:top w:val="nil"/>
+              <w:bottom w:val="single" w:sz="4" w:color="D9E1E8"/>
+            </w:tcBorders>
+            <w:vAlign w:val="center"/>
+          </w:tcPr>
+          <w:p>
+            <w:pPr>
+              <w:pStyle w:val="Compact"/>
+              <w:spacing w:before="0" w:after="20" w:line="240" w:lineRule="auto"/>
+              <w:jc w:val="center"/>
+              <w:suppressAutoHyphens/>
+              <w:keepNext w:val="0"/>
+              <w:keepLines/>
+              <w:widowControl w:val="1"/>
+            </w:pPr>
+            <w:r>
+              <w:rPr>
+                <w:rFonts w:ascii="Times New Roman" w:hAnsi="Times New Roman"/>
+                <w:sz w:val="19"/>
+              </w:rPr>
+              <w:t xml:space="preserve">source corpus license</w:t>
+            </w:r>
+          </w:p>
+        </w:tc>
+        <w:tc>
+          <w:tcPr>
+            <w:tcBorders>
+              <w:left w:val="nil"/>
+              <w:right w:val="nil"/>
+              <w:top w:val="nil"/>
+              <w:bottom w:val="single" w:sz="4" w:color="D9E1E8"/>
+            </w:tcBorders>
+            <w:vAlign w:val="center"/>
+          </w:tcPr>
+          <w:p>
+            <w:pPr>
+              <w:pStyle w:val="Compact"/>
+              <w:spacing w:before="0" w:after="20" w:line="240" w:lineRule="auto"/>
+              <w:jc w:val="center"/>
+              <w:suppressAutoHyphens/>
+              <w:keepNext w:val="0"/>
+              <w:keepLines/>
+              <w:widowControl w:val="1"/>
+            </w:pPr>
+            <w:r>
+              <w:rPr>
+                <w:rFonts w:ascii="Times New Roman" w:hAnsi="Times New Roman"/>
+                <w:sz w:val="19"/>
+              </w:rPr>
+              <w:t xml:space="preserve">annotations only, no MIMIC text</w:t>
+            </w:r>
+          </w:p>
+        </w:tc>
+        <w:tc>
+          <w:tcPr>
+            <w:tcBorders>
+              <w:left w:val="nil"/>
+              <w:right w:val="nil"/>
+              <w:top w:val="nil"/>
+              <w:bottom w:val="single" w:sz="4" w:color="D9E1E8"/>
+            </w:tcBorders>
+            <w:vAlign w:val="center"/>
+          </w:tcPr>
+          <w:p>
+            <w:pPr>
+              <w:pStyle w:val="Compact"/>
+              <w:spacing w:before="0" w:after="20" w:line="240" w:lineRule="auto"/>
+              <w:jc w:val="center"/>
+              <w:suppressAutoHyphens/>
+              <w:keepNext w:val="0"/>
+              <w:keepLines/>
+              <w:widowControl w:val="1"/>
+            </w:pPr>
+            <w:r>
+              <w:rPr>
+                <w:rFonts w:ascii="Times New Roman" w:hAnsi="Times New Roman"/>
+                <w:sz w:val="19"/>
+              </w:rPr>
+              <w:t xml:space="preserve">PhysioNet credentialed + rebuild script</w:t>
+            </w:r>
+          </w:p>
+        </w:tc>
+      </w:tr>
+      <w:tr>
+        <w:tc>
+          <w:tcPr>
+            <w:tcBorders>
+              <w:left w:val="nil"/>
+              <w:right w:val="nil"/>
+              <w:top w:val="nil"/>
+              <w:bottom w:val="single" w:sz="4" w:color="D9E1E8"/>
+            </w:tcBorders>
+            <w:vAlign w:val="center"/>
+          </w:tcPr>
+          <w:p>
+            <w:pPr>
+              <w:pStyle w:val="Compact"/>
+              <w:spacing w:before="0" w:after="20" w:line="240" w:lineRule="auto"/>
+              <w:jc w:val="center"/>
+              <w:suppressAutoHyphens/>
+              <w:keepNext w:val="0"/>
+              <w:keepLines/>
+              <w:widowControl w:val="1"/>
+            </w:pPr>
+            <w:r>
+              <w:rPr>
+                <w:rFonts w:ascii="Times New Roman" w:hAnsi="Times New Roman"/>
+                <w:sz w:val="19"/>
+              </w:rPr>
+              <w:t xml:space="preserve">PaniniQA</w:t>
+            </w:r>
+          </w:p>
+        </w:tc>
+        <w:tc>
+          <w:tcPr>
+            <w:tcBorders>
+              <w:left w:val="nil"/>
+              <w:right w:val="nil"/>
+              <w:top w:val="nil"/>
+              <w:bottom w:val="single" w:sz="4" w:color="D9E1E8"/>
+            </w:tcBorders>
+            <w:vAlign w:val="center"/>
+          </w:tcPr>
+          <w:p>
+            <w:pPr>
+              <w:pStyle w:val="Compact"/>
+              <w:spacing w:before="0" w:after="20" w:line="240" w:lineRule="auto"/>
+              <w:jc w:val="center"/>
+              <w:suppressAutoHyphens/>
+              <w:keepNext w:val="0"/>
+              <w:keepLines/>
+              <w:widowControl w:val="1"/>
+            </w:pPr>
+            <w:r>
+              <w:rPr>
+                <w:rFonts w:ascii="Times New Roman" w:hAnsi="Times New Roman"/>
+                <w:sz w:val="19"/>
+              </w:rPr>
+              <w:t xml:space="preserve">MIMIC-III (PhysioNet DUA)</w:t>
+            </w:r>
+          </w:p>
+        </w:tc>
+        <w:tc>
+          <w:tcPr>
+            <w:tcBorders>
+              <w:left w:val="nil"/>
+              <w:right w:val="nil"/>
+              <w:top w:val="nil"/>
+              <w:bottom w:val="single" w:sz="4" w:color="D9E1E8"/>
+            </w:tcBorders>
+            <w:vAlign w:val="center"/>
+          </w:tcPr>
+          <w:p>
+            <w:pPr>
+              <w:pStyle w:val="Compact"/>
+              <w:spacing w:before="0" w:after="20" w:line="240" w:lineRule="auto"/>
+              <w:jc w:val="center"/>
+              <w:suppressAutoHyphens/>
+              <w:keepNext w:val="0"/>
+              <w:keepLines/>
+              <w:widowControl w:val="1"/>
+            </w:pPr>
+            <w:r>
+              <w:rPr>
+                <w:rFonts w:ascii="Times New Roman" w:hAnsi="Times New Roman"/>
+                <w:sz w:val="19"/>
+              </w:rPr>
+              <w:t xml:space="preserve">source corpus license</w:t>
+            </w:r>
+          </w:p>
+        </w:tc>
+        <w:tc>
+          <w:tcPr>
+            <w:tcBorders>
+              <w:left w:val="nil"/>
+              <w:right w:val="nil"/>
+              <w:top w:val="nil"/>
+              <w:bottom w:val="single" w:sz="4" w:color="D9E1E8"/>
+            </w:tcBorders>
+            <w:vAlign w:val="center"/>
+          </w:tcPr>
+          <w:p>
+            <w:pPr>
+              <w:pStyle w:val="Compact"/>
+              <w:spacing w:before="0" w:after="20" w:line="240" w:lineRule="auto"/>
+              <w:jc w:val="center"/>
+              <w:suppressAutoHyphens/>
+              <w:keepNext w:val="0"/>
+              <w:keepLines/>
+              <w:widowControl w:val="1"/>
+            </w:pPr>
+            <w:r>
+              <w:rPr>
+                <w:rFonts w:ascii="Times New Roman" w:hAnsi="Times New Roman"/>
+                <w:sz w:val="19"/>
+              </w:rPr>
+              <w:t xml:space="preserve">annotations only, no MIMIC text</w:t>
+            </w:r>
+          </w:p>
+        </w:tc>
+        <w:tc>
+          <w:tcPr>
+            <w:tcBorders>
+              <w:left w:val="nil"/>
+              <w:right w:val="nil"/>
+              <w:top w:val="nil"/>
+              <w:bottom w:val="single" w:sz="4" w:color="D9E1E8"/>
+            </w:tcBorders>
+            <w:vAlign w:val="center"/>
+          </w:tcPr>
+          <w:p>
+            <w:pPr>
+              <w:pStyle w:val="Compact"/>
+              <w:spacing w:before="0" w:after="20" w:line="240" w:lineRule="auto"/>
+              <w:jc w:val="center"/>
+              <w:suppressAutoHyphens/>
+              <w:keepNext w:val="0"/>
+              <w:keepLines/>
+              <w:widowControl w:val="1"/>
+            </w:pPr>
+            <w:r>
+              <w:rPr>
+                <w:rFonts w:ascii="Times New Roman" w:hAnsi="Times New Roman"/>
+                <w:sz w:val="19"/>
+              </w:rPr>
+              <w:t xml:space="preserve">PhysioNet credentialed + rebuild script</w:t>
+            </w:r>
+          </w:p>
+        </w:tc>
+      </w:tr>
+      <w:tr>
+        <w:tc>
+          <w:tcPr>
+            <w:tcBorders>
+              <w:left w:val="nil"/>
+              <w:right w:val="nil"/>
+              <w:top w:val="nil"/>
+              <w:bottom w:val="single" w:sz="4" w:color="D9E1E8"/>
+            </w:tcBorders>
+            <w:vAlign w:val="center"/>
+          </w:tcPr>
+          <w:p>
+            <w:pPr>
+              <w:pStyle w:val="Compact"/>
+              <w:spacing w:before="0" w:after="20" w:line="240" w:lineRule="auto"/>
+              <w:jc w:val="center"/>
+              <w:suppressAutoHyphens/>
+              <w:keepNext w:val="0"/>
+              <w:keepLines/>
+              <w:widowControl w:val="1"/>
+            </w:pPr>
+            <w:r>
+              <w:rPr>
+                <w:rFonts w:ascii="Times New Roman" w:hAnsi="Times New Roman"/>
+                <w:sz w:val="19"/>
+              </w:rPr>
+              <w:t xml:space="preserve">SIMORD / ACI-Bench</w:t>
+            </w:r>
+          </w:p>
+        </w:tc>
+        <w:tc>
+          <w:tcPr>
+            <w:tcBorders>
+              <w:left w:val="nil"/>
+              <w:right w:val="nil"/>
+              <w:top w:val="nil"/>
+              <w:bottom w:val="single" w:sz="4" w:color="D9E1E8"/>
+            </w:tcBorders>
+            <w:vAlign w:val="center"/>
+          </w:tcPr>
+          <w:p>
+            <w:pPr>
+              <w:pStyle w:val="Compact"/>
+              <w:spacing w:before="0" w:after="20" w:line="240" w:lineRule="auto"/>
+              <w:jc w:val="center"/>
+              <w:suppressAutoHyphens/>
+              <w:keepNext w:val="0"/>
+              <w:keepLines/>
+              <w:widowControl w:val="1"/>
+            </w:pPr>
+            <w:r>
+              <w:rPr>
+                <w:rFonts w:ascii="Times New Roman" w:hAnsi="Times New Roman"/>
+                <w:sz w:val="19"/>
+              </w:rPr>
+              <w:t xml:space="preserve">ACI-Bench (public, simulated, CC BY 4.0)</w:t>
+            </w:r>
+          </w:p>
+        </w:tc>
+        <w:tc>
+          <w:tcPr>
+            <w:tcBorders>
+              <w:left w:val="nil"/>
+              <w:right w:val="nil"/>
+              <w:top w:val="nil"/>
+              <w:bottom w:val="single" w:sz="4" w:color="D9E1E8"/>
+            </w:tcBorders>
+            <w:vAlign w:val="center"/>
+          </w:tcPr>
+          <w:p>
+            <w:pPr>
+              <w:pStyle w:val="Compact"/>
+              <w:spacing w:before="0" w:after="20" w:line="240" w:lineRule="auto"/>
+              <w:jc w:val="center"/>
+              <w:suppressAutoHyphens/>
+              <w:keepNext w:val="0"/>
+              <w:keepLines/>
+              <w:widowControl w:val="1"/>
+            </w:pPr>
+            <w:r>
+              <w:rPr>
+                <w:rFonts w:ascii="Times New Roman" w:hAnsi="Times New Roman"/>
+                <w:sz w:val="19"/>
+              </w:rPr>
+              <w:t xml:space="preserve">CDLA-Permissive-2.0</w:t>
+            </w:r>
+          </w:p>
+        </w:tc>
+        <w:tc>
+          <w:tcPr>
+            <w:tcBorders>
+              <w:left w:val="nil"/>
+              <w:right w:val="nil"/>
+              <w:top w:val="nil"/>
+              <w:bottom w:val="single" w:sz="4" w:color="D9E1E8"/>
+            </w:tcBorders>
+            <w:vAlign w:val="center"/>
+          </w:tcPr>
+          <w:p>
+            <w:pPr>
+              <w:pStyle w:val="Compact"/>
+              <w:spacing w:before="0" w:after="20" w:line="240" w:lineRule="auto"/>
+              <w:jc w:val="center"/>
+              <w:suppressAutoHyphens/>
+              <w:keepNext w:val="0"/>
+              <w:keepLines/>
+              <w:widowControl w:val="1"/>
+            </w:pPr>
+            <w:r>
+              <w:rPr>
+                <w:rFonts w:ascii="Times New Roman" w:hAnsi="Times New Roman"/>
+                <w:sz w:val="19"/>
+              </w:rPr>
+              <w:t xml:space="preserve">text and annotations</w:t>
+            </w:r>
+          </w:p>
+        </w:tc>
+        <w:tc>
+          <w:tcPr>
+            <w:tcBorders>
+              <w:left w:val="nil"/>
+              <w:right w:val="nil"/>
+              <w:top w:val="nil"/>
+              <w:bottom w:val="single" w:sz="4" w:color="D9E1E8"/>
+            </w:tcBorders>
+            <w:vAlign w:val="center"/>
+          </w:tcPr>
+          <w:p>
+            <w:pPr>
+              <w:pStyle w:val="Compact"/>
+              <w:spacing w:before="0" w:after="20" w:line="240" w:lineRule="auto"/>
+              <w:jc w:val="center"/>
+              <w:suppressAutoHyphens/>
+              <w:keepNext w:val="0"/>
+              <w:keepLines/>
+              <w:widowControl w:val="1"/>
+            </w:pPr>
+            <w:r>
+              <w:rPr>
+                <w:rFonts w:ascii="Times New Roman" w:hAnsi="Times New Roman"/>
+                <w:sz w:val="19"/>
+              </w:rPr>
+              <w:t xml:space="preserve">direct download</w:t>
+            </w:r>
+          </w:p>
+        </w:tc>
+      </w:tr>
+      <w:tr>
+        <w:tc>
+          <w:tcPr>
+            <w:tcBorders>
+              <w:left w:val="nil"/>
+              <w:right w:val="nil"/>
+              <w:top w:val="nil"/>
+              <w:bottom w:val="nil"/>
+            </w:tcBorders>
+            <w:vAlign w:val="center"/>
+          </w:tcPr>
+          <w:p>
+            <w:pPr>
+              <w:pStyle w:val="Compact"/>
+              <w:spacing w:before="0" w:after="20" w:line="240" w:lineRule="auto"/>
+              <w:jc w:val="center"/>
+              <w:suppressAutoHyphens/>
+              <w:keepNext w:val="0"/>
+              <w:keepLines/>
+              <w:widowControl w:val="1"/>
+            </w:pPr>
+            <w:r>
+              <w:rPr>
+                <w:rFonts w:ascii="Times New Roman" w:hAnsi="Times New Roman"/>
+                <w:sz w:val="19"/>
+              </w:rPr>
+              <w:t xml:space="preserve">CIR annotation layer (ours)</w:t>
+            </w:r>
+          </w:p>
+        </w:tc>
+        <w:tc>
+          <w:tcPr>
+            <w:tcBorders>
+              <w:left w:val="nil"/>
+              <w:right w:val="nil"/>
+              <w:top w:val="nil"/>
+              <w:bottom w:val="nil"/>
+            </w:tcBorders>
+            <w:vAlign w:val="center"/>
+          </w:tcPr>
+          <w:p>
+            <w:pPr>
+              <w:pStyle w:val="Compact"/>
+              <w:spacing w:before="0" w:after="20" w:line="240" w:lineRule="auto"/>
+              <w:jc w:val="center"/>
+              <w:suppressAutoHyphens/>
+              <w:keepNext w:val="0"/>
+              <w:keepLines/>
+              <w:widowControl w:val="1"/>
+            </w:pPr>
+            <w:r>
+              <w:rPr>
+                <w:rFonts w:ascii="Times New Roman" w:hAnsi="Times New Roman"/>
+                <w:sz w:val="19"/>
+              </w:rPr>
+              <w:t xml:space="preserve">per source layer above</w:t>
+            </w:r>
+          </w:p>
+        </w:tc>
+        <w:tc>
+          <w:tcPr>
+            <w:tcBorders>
+              <w:left w:val="nil"/>
+              <w:right w:val="nil"/>
+              <w:top w:val="nil"/>
+              <w:bottom w:val="nil"/>
+            </w:tcBorders>
+            <w:vAlign w:val="center"/>
+          </w:tcPr>
+          <w:p>
+            <w:pPr>
+              <w:pStyle w:val="Compact"/>
+              <w:spacing w:before="0" w:after="20" w:line="240" w:lineRule="auto"/>
+              <w:jc w:val="center"/>
+              <w:suppressAutoHyphens/>
+              <w:keepNext w:val="0"/>
+              <w:keepLines/>
+              <w:widowControl w:val="1"/>
+            </w:pPr>
+            <w:r>
+              <w:rPr>
+                <w:rFonts w:ascii="Times New Roman" w:hAnsi="Times New Roman"/>
+                <w:sz w:val="19"/>
+              </w:rPr>
+              <w:t xml:space="preserve">CC BY 4.0</w:t>
+            </w:r>
+          </w:p>
+        </w:tc>
+        <w:tc>
+          <w:tcPr>
+            <w:tcBorders>
+              <w:left w:val="nil"/>
+              <w:right w:val="nil"/>
+              <w:top w:val="nil"/>
+              <w:bottom w:val="nil"/>
+            </w:tcBorders>
+            <w:vAlign w:val="center"/>
+          </w:tcPr>
+          <w:p>
+            <w:pPr>
+              <w:pStyle w:val="Compact"/>
+              <w:spacing w:before="0" w:after="20" w:line="240" w:lineRule="auto"/>
+              <w:jc w:val="center"/>
+              <w:suppressAutoHyphens/>
+              <w:keepNext w:val="0"/>
+              <w:keepLines/>
+              <w:widowControl w:val="1"/>
+            </w:pPr>
+            <w:r>
+              <w:rPr>
+                <w:rFonts w:ascii="Times New Roman" w:hAnsi="Times New Roman"/>
+                <w:sz w:val="19"/>
+              </w:rPr>
+              <w:t xml:space="preserve">annotations + crosswalks + code</w:t>
+            </w:r>
+          </w:p>
+        </w:tc>
+        <w:tc>
+          <w:tcPr>
+            <w:tcBorders>
+              <w:left w:val="nil"/>
+              <w:right w:val="nil"/>
+              <w:top w:val="nil"/>
+              <w:bottom w:val="nil"/>
+            </w:tcBorders>
+            <w:vAlign w:val="center"/>
+          </w:tcPr>
+          <w:p>
+            <w:pPr>
+              <w:pStyle w:val="Compact"/>
+              <w:spacing w:before="0" w:after="20" w:line="240" w:lineRule="auto"/>
+              <w:jc w:val="center"/>
+              <w:suppressAutoHyphens/>
+              <w:keepNext w:val="0"/>
+              <w:keepLines/>
+              <w:widowControl w:val="1"/>
+            </w:pPr>
+            <w:r>
+              <w:rPr>
+                <w:rFonts w:ascii="Times New Roman" w:hAnsi="Times New Roman"/>
+                <w:sz w:val="19"/>
+              </w:rPr>
+              <w:t xml:space="preserve">repository</w:t>
+            </w:r>
+          </w:p>
+        </w:tc>
+      </w:tr>
+    </w:tbl>
+    <w:p>
+      <w:pPr>
+        <w:pStyle w:val="TableCaption"/>
+        <w:spacing w:before="40" w:after="40" w:line="240" w:lineRule="auto"/>
+        <w:jc w:val="center"/>
+        <w:keepNext/>
+        <w:keepLines/>
+        <w:widowControl w:val="1"/>
+      </w:pPr>
+      <w:r>
+        <w:rPr>
+          <w:b/>
+          <w:i/>
+        </w:rPr>
+        <w:t>Table 15.</w:t>
+      </w:r>
+      <w:r>
+        <w:rPr>
+          <w:b w:val="0"/>
+          <w:i/>
+        </w:rPr>
+        <w:t xml:space="preserve"> </w:t>
+      </w:r>
+      <w:r>
+        <w:rPr>
+          <w:b w:val="0"/>
+          <w:i/>
+        </w:rPr>
+        <w:t>Per-layer rights and access. The combined resource does not carry a single uniform license: each layer inherits the rights of its underlying text, and only the SIMORD/ACI-Bench layer can be redistributed with its text. The mapper, evaluator, and crosswalks are released under an open code license.</w:t>
       </w:r>
     </w:p>
     <w:bookmarkEnd w:id="53"/>
@@ -26763,7 +26761,7 @@
       <w:b/>
       <w:bCs/>
       <w:i w:val="0"/>
-      <w:color w:themeColor="accent1" w:themeShade="BF" w:val="365F91"/>
+      <w:color w:val="000000"/>
       <w:sz w:val="28"/>
       <w:szCs w:val="28"/>
     </w:rPr>
@@ -26788,7 +26786,7 @@
       <w:b/>
       <w:bCs/>
       <w:i w:val="0"/>
-      <w:color w:themeColor="accent1" w:val="4F81BD"/>
+      <w:color w:val="000000"/>
       <w:sz w:val="24"/>
       <w:szCs w:val="26"/>
     </w:rPr>
@@ -26813,7 +26811,7 @@
       <w:b/>
       <w:bCs/>
       <w:i w:val="0"/>
-      <w:color w:themeColor="accent1" w:val="4F81BD"/>
+      <w:color w:val="000000"/>
       <w:sz w:val="22"/>
     </w:rPr>
   </w:style>
@@ -26839,7 +26837,7 @@
       <w:bCs/>
       <w:i/>
       <w:iCs/>
-      <w:color w:themeColor="accent1" w:val="4F81BD"/>
+      <w:color w:val="000000"/>
     </w:rPr>
   </w:style>
   <w:style w:styleId="Heading5" w:type="paragraph">
@@ -27057,7 +27055,7 @@
       <w:rFonts w:ascii="Times New Roman" w:asciiTheme="majorHAnsi" w:cstheme="majorBidi" w:eastAsiaTheme="majorEastAsia" w:hAnsi="Times New Roman" w:hAnsiTheme="majorHAnsi"/>
       <w:b/>
       <w:i w:val="0"/>
-      <w:color w:themeColor="text2" w:themeShade="BF" w:val="17365D"/>
+      <w:color w:val="000000"/>
       <w:spacing w:val="5"/>
       <w:kern w:val="28"/>
       <w:sz w:val="36"/>
@@ -27100,7 +27098,7 @@
       <w:b w:val="0"/>
       <w:i w:val="0"/>
       <w:iCs/>
-      <w:color w:themeColor="accent1" w:val="4F81BD"/>
+      <w:color w:val="000000"/>
       <w:spacing w:val="15"/>
       <w:sz w:val="24"/>
       <w:szCs w:val="24"/>
@@ -27508,7 +27506,7 @@
     <w:qFormat/>
     <w:rsid w:val="00FC693F"/>
     <w:pPr>
-      <w:spacing w:line="240" w:lineRule="auto"/>
+      <w:spacing w:line="240" w:lineRule="auto" w:before="40" w:after="40"/>
     </w:pPr>
     <w:rPr>
       <w:b/>
@@ -38472,7 +38470,7 @@
     <w:basedOn w:val="BodyText"/>
     <w:pPr>
       <w:keepNext w:val="0"/>
-      <w:spacing w:after="120" w:before="80" w:line="240" w:lineRule="auto"/>
+      <w:spacing w:after="40" w:before="40" w:line="240" w:lineRule="auto"/>
       <w:jc w:val="center"/>
     </w:pPr>
     <w:rPr>
@@ -38487,7 +38485,7 @@
     <w:basedOn w:val="BodyText"/>
     <w:pPr>
       <w:keepNext/>
-      <w:spacing w:after="60" w:before="280" w:line="240" w:lineRule="auto"/>
+      <w:spacing w:after="40" w:before="40" w:line="240" w:lineRule="auto"/>
       <w:jc w:val="center"/>
     </w:pPr>
     <w:rPr>

</xml_diff>

<commit_message>
Zenodo deposit published: DOI 10.5281/zenodo.22251272 (concept 22251271)
Replaced the pre-publication placeholder DOI (10.5281/zenodo.22058593) with the real one Zenodo assigned. Deposit is the CIR annotation layer (CC BY 4.0); ACI-Bench text ships inside under its original CDLA-Permissive-2.0. Record: https://zenodo.org/records/22251272

Rebuilt LaTeX PDF and 1-column DOCX to embed the new DOI in the paper's Data availability section.

Co-Authored-By: Claude Opus 4.7 <noreply@anthropic.com>
</commit_message>
<xml_diff>
--- a/circa_1col.docx
+++ b/circa_1col.docx
@@ -21125,7 +21125,7 @@
           <w:rPr>
             <w:rStyle w:val="Hyperlink"/>
           </w:rPr>
-          <w:t xml:space="preserve">https://doi.org/10.5281/zenodo.22058593</w:t>
+          <w:t xml:space="preserve">https://doi.org/10.5281/zenodo.22251272</w:t>
         </w:r>
       </w:hyperlink>
       <w:r>
@@ -24861,7 +24861,7 @@
           <w:rPr>
             <w:rStyle w:val="Hyperlink"/>
           </w:rPr>
-          <w:t xml:space="preserve">https://doi.org/10.5281/zenodo.22058593</w:t>
+          <w:t xml:space="preserve">https://doi.org/10.5281/zenodo.22251272</w:t>
         </w:r>
       </w:hyperlink>
       <w:r>

</xml_diff>